<commit_message>
docs: matriz de trazabilidad, Product Vision y ficha del Sprint 3 actualizada al 06-10
</commit_message>
<xml_diff>
--- a/docs/fase2/evidencias_proyecto/documentacion/agil/Fichas_Sprint_1-3_DomoVida.docx
+++ b/docs/fase2/evidencias_proyecto/documentacion/agil/Fichas_Sprint_1-3_DomoVida.docx
@@ -28,7 +28,7 @@
           <w:sz w:val="26"/>
           <w:szCs w:val="26"/>
         </w:rPr>
-        <w:t xml:space="preserve">Fichas de sprint y retrospectivas — Sprints 1, 2 y 3</w:t>
+        <w:t>Fichas de sprint y retrospectivas — Sprints 1, 2 y 3 (actualizado al 6 de octubre de 2026)</w:t>
       </w:r>
     </w:p>
     <w:p>
@@ -247,7 +247,7 @@
                 <w:sz w:val="20"/>
                 <w:szCs w:val="20"/>
               </w:rPr>
-              <w:t xml:space="preserve">Estado al 01/10/2026</w:t>
+              <w:t>Estado al 06/10/2026</w:t>
             </w:r>
           </w:p>
         </w:tc>
@@ -601,7 +601,7 @@
                 <w:sz w:val="20"/>
                 <w:szCs w:val="20"/>
               </w:rPr>
-              <w:t xml:space="preserve">En curso (corte al 01/10)</w:t>
+              <w:t>En curso (cierra el 11/10; corte al 06/10)</w:t>
             </w:r>
           </w:p>
         </w:tc>
@@ -5274,6 +5274,1686 @@
                 <w:szCs w:val="20"/>
               </w:rPr>
               <w:t xml:space="preserve">Después de cada git push, revisar que Vercel y Render queden con el despliegue en «Listo/Live», y abrir el panel publicado al menos una vez por semana para que Supabase no se pause · Andrés Vergara · desde el 2 de octubre de 2026.</w:t>
+            </w:r>
+          </w:p>
+        </w:tc>
+      </w:tr>
+    </w:tbl>
+    <w:p>
+      <w:r>
+        <w:br w:type="page"/>
+      </w:r>
+    </w:p>
+    <w:p>
+      <w:pPr>
+        <w:pStyle w:val="Heading1"/>
+        <w:pageBreakBefore/>
+      </w:pPr>
+      <w:r>
+        <w:t>Sprint 3 (S7–S9) — actualización al 6 de octubre</w:t>
+      </w:r>
+    </w:p>
+    <w:p>
+      <w:pPr>
+        <w:pStyle w:val="Heading2"/>
+      </w:pPr>
+      <w:r>
+        <w:t>Ficha de sprint (2 al 6 de octubre de 2026)</w:t>
+      </w:r>
+    </w:p>
+    <w:p>
+      <w:pPr>
+        <w:spacing w:after="80" w:before="120"/>
+      </w:pPr>
+      <w:r>
+        <w:rPr>
+          <w:i/>
+          <w:iCs/>
+          <w:sz w:val="20"/>
+          <w:szCs w:val="20"/>
+        </w:rPr>
+        <w:t>Tabla E. Ficha del Sprint 3, actualización del 2 al 6 de octubre</w:t>
+      </w:r>
+    </w:p>
+    <w:tbl>
+      <w:tblPr>
+        <w:tblW w:type="dxa" w:w="9360"/>
+        <w:tblBorders>
+          <w:top w:val="single" w:color="auto" w:sz="4"/>
+          <w:left w:val="single" w:color="auto" w:sz="4"/>
+          <w:bottom w:val="single" w:color="auto" w:sz="4"/>
+          <w:right w:val="single" w:color="auto" w:sz="4"/>
+          <w:insideH w:val="single" w:color="auto" w:sz="4"/>
+          <w:insideV w:val="single" w:color="auto" w:sz="4"/>
+        </w:tblBorders>
+      </w:tblPr>
+      <w:tblGrid>
+        <w:gridCol w:w="2500"/>
+        <w:gridCol w:w="6860"/>
+      </w:tblGrid>
+      <w:tr>
+        <w:trPr>
+          <w:tblHeader/>
+        </w:trPr>
+        <w:tc>
+          <w:tcPr>
+            <w:tcW w:type="dxa" w:w="2500"/>
+            <w:tcBorders>
+              <w:top w:val="single" w:color="8EAADB" w:sz="4"/>
+              <w:left w:val="single" w:color="8EAADB" w:sz="4"/>
+              <w:bottom w:val="single" w:color="8EAADB" w:sz="4"/>
+              <w:right w:val="single" w:color="8EAADB" w:sz="4"/>
+            </w:tcBorders>
+            <w:shd w:fill="2F5496" w:color="auto" w:val="clear"/>
+            <w:tcMar>
+              <w:top w:type="dxa" w:w="60"/>
+              <w:left w:type="dxa" w:w="100"/>
+              <w:bottom w:type="dxa" w:w="60"/>
+              <w:right w:type="dxa" w:w="100"/>
+            </w:tcMar>
+          </w:tcPr>
+          <w:p>
+            <w:r>
+              <w:rPr>
+                <w:b/>
+                <w:bCs/>
+                <w:color w:val="FFFFFF"/>
+                <w:sz w:val="20"/>
+                <w:szCs w:val="20"/>
+              </w:rPr>
+              <w:t xml:space="preserve">Campo</w:t>
+            </w:r>
+          </w:p>
+        </w:tc>
+        <w:tc>
+          <w:tcPr>
+            <w:tcW w:type="dxa" w:w="6860"/>
+            <w:tcBorders>
+              <w:top w:val="single" w:color="8EAADB" w:sz="4"/>
+              <w:left w:val="single" w:color="8EAADB" w:sz="4"/>
+              <w:bottom w:val="single" w:color="8EAADB" w:sz="4"/>
+              <w:right w:val="single" w:color="8EAADB" w:sz="4"/>
+            </w:tcBorders>
+            <w:shd w:fill="2F5496" w:color="auto" w:val="clear"/>
+            <w:tcMar>
+              <w:top w:type="dxa" w:w="60"/>
+              <w:left w:type="dxa" w:w="100"/>
+              <w:bottom w:type="dxa" w:w="60"/>
+              <w:right w:type="dxa" w:w="100"/>
+            </w:tcMar>
+          </w:tcPr>
+          <w:p>
+            <w:r>
+              <w:rPr>
+                <w:b/>
+                <w:bCs/>
+                <w:color w:val="FFFFFF"/>
+                <w:sz w:val="20"/>
+                <w:szCs w:val="20"/>
+              </w:rPr>
+              <w:t xml:space="preserve">Contenido</w:t>
+            </w:r>
+          </w:p>
+        </w:tc>
+      </w:tr>
+      <w:tr>
+        <w:tc>
+          <w:tcPr>
+            <w:tcW w:type="dxa" w:w="2500"/>
+            <w:tcBorders>
+              <w:top w:val="single" w:color="8EAADB" w:sz="4"/>
+              <w:left w:val="single" w:color="8EAADB" w:sz="4"/>
+              <w:bottom w:val="single" w:color="8EAADB" w:sz="4"/>
+              <w:right w:val="single" w:color="8EAADB" w:sz="4"/>
+            </w:tcBorders>
+            <w:shd w:fill="F2F2F2" w:color="auto" w:val="clear"/>
+            <w:tcMar>
+              <w:top w:type="dxa" w:w="60"/>
+              <w:left w:type="dxa" w:w="100"/>
+              <w:bottom w:type="dxa" w:w="60"/>
+              <w:right w:type="dxa" w:w="100"/>
+            </w:tcMar>
+          </w:tcPr>
+          <w:p>
+            <w:pPr>
+              <w:spacing w:after="40"/>
+            </w:pPr>
+            <w:r>
+              <w:rPr>
+                <w:b/>
+                <w:bCs/>
+                <w:sz w:val="20"/>
+                <w:szCs w:val="20"/>
+              </w:rPr>
+              <w:t xml:space="preserve">Sprint o ciclo</w:t>
+            </w:r>
+          </w:p>
+        </w:tc>
+        <w:tc>
+          <w:tcPr>
+            <w:tcW w:type="dxa" w:w="6860"/>
+            <w:tcBorders>
+              <w:top w:val="single" w:color="8EAADB" w:sz="4"/>
+              <w:left w:val="single" w:color="8EAADB" w:sz="4"/>
+              <w:bottom w:val="single" w:color="8EAADB" w:sz="4"/>
+              <w:right w:val="single" w:color="8EAADB" w:sz="4"/>
+            </w:tcBorders>
+            <w:tcMar>
+              <w:top w:type="dxa" w:w="60"/>
+              <w:left w:type="dxa" w:w="100"/>
+              <w:bottom w:type="dxa" w:w="60"/>
+              <w:right w:type="dxa" w:w="100"/>
+            </w:tcMar>
+          </w:tcPr>
+          <w:p>
+            <w:pPr>
+              <w:spacing w:after="40"/>
+            </w:pPr>
+            <w:r>
+              <w:rPr>
+                <w:sz w:val="20"/>
+                <w:szCs w:val="20"/>
+              </w:rPr>
+              <w:t>Sprint 3 · actualización del 2 al 6 de octubre de 2026 (el sprint cierra el 11 de octubre)</w:t>
+            </w:r>
+          </w:p>
+        </w:tc>
+      </w:tr>
+      <w:tr>
+        <w:tc>
+          <w:tcPr>
+            <w:tcW w:type="dxa" w:w="2500"/>
+            <w:tcBorders>
+              <w:top w:val="single" w:color="8EAADB" w:sz="4"/>
+              <w:left w:val="single" w:color="8EAADB" w:sz="4"/>
+              <w:bottom w:val="single" w:color="8EAADB" w:sz="4"/>
+              <w:right w:val="single" w:color="8EAADB" w:sz="4"/>
+            </w:tcBorders>
+            <w:shd w:fill="F2F2F2" w:color="auto" w:val="clear"/>
+            <w:tcMar>
+              <w:top w:type="dxa" w:w="60"/>
+              <w:left w:type="dxa" w:w="100"/>
+              <w:bottom w:type="dxa" w:w="60"/>
+              <w:right w:type="dxa" w:w="100"/>
+            </w:tcMar>
+          </w:tcPr>
+          <w:p>
+            <w:pPr>
+              <w:spacing w:after="40"/>
+            </w:pPr>
+            <w:r>
+              <w:rPr>
+                <w:b/>
+                <w:bCs/>
+                <w:sz w:val="20"/>
+                <w:szCs w:val="20"/>
+              </w:rPr>
+              <w:t xml:space="preserve">Objetivo</w:t>
+            </w:r>
+          </w:p>
+        </w:tc>
+        <w:tc>
+          <w:tcPr>
+            <w:tcW w:type="dxa" w:w="6860"/>
+            <w:tcBorders>
+              <w:top w:val="single" w:color="8EAADB" w:sz="4"/>
+              <w:left w:val="single" w:color="8EAADB" w:sz="4"/>
+              <w:bottom w:val="single" w:color="8EAADB" w:sz="4"/>
+              <w:right w:val="single" w:color="8EAADB" w:sz="4"/>
+            </w:tcBorders>
+            <w:tcMar>
+              <w:top w:type="dxa" w:w="60"/>
+              <w:left w:type="dxa" w:w="100"/>
+              <w:bottom w:type="dxa" w:w="60"/>
+              <w:right w:type="dxa" w:w="100"/>
+            </w:tcMar>
+          </w:tcPr>
+          <w:p>
+            <w:pPr>
+              <w:spacing w:after="40"/>
+            </w:pPr>
+            <w:r>
+              <w:rPr>
+                <w:sz w:val="20"/>
+                <w:szCs w:val="20"/>
+              </w:rPr>
+              <w:t>Cerrar las validaciones pendientes del prototipo (rendimiento, continuidad sin conexión, entrega de notificaciones, interoperabilidad y seguridad) y dejar el repositorio listo para la entrega de la Guía 2.4.</w:t>
+            </w:r>
+          </w:p>
+        </w:tc>
+      </w:tr>
+      <w:tr>
+        <w:tc>
+          <w:tcPr>
+            <w:tcW w:type="dxa" w:w="2500"/>
+            <w:tcBorders>
+              <w:top w:val="single" w:color="8EAADB" w:sz="4"/>
+              <w:left w:val="single" w:color="8EAADB" w:sz="4"/>
+              <w:bottom w:val="single" w:color="8EAADB" w:sz="4"/>
+              <w:right w:val="single" w:color="8EAADB" w:sz="4"/>
+            </w:tcBorders>
+            <w:shd w:fill="F2F2F2" w:color="auto" w:val="clear"/>
+            <w:tcMar>
+              <w:top w:type="dxa" w:w="60"/>
+              <w:left w:type="dxa" w:w="100"/>
+              <w:bottom w:type="dxa" w:w="60"/>
+              <w:right w:type="dxa" w:w="100"/>
+            </w:tcMar>
+          </w:tcPr>
+          <w:p>
+            <w:pPr>
+              <w:spacing w:after="40"/>
+            </w:pPr>
+            <w:r>
+              <w:rPr>
+                <w:b/>
+                <w:bCs/>
+                <w:sz w:val="20"/>
+                <w:szCs w:val="20"/>
+              </w:rPr>
+              <w:t xml:space="preserve">Historias comprometidas</w:t>
+            </w:r>
+          </w:p>
+        </w:tc>
+        <w:tc>
+          <w:tcPr>
+            <w:tcW w:type="dxa" w:w="6860"/>
+            <w:tcBorders>
+              <w:top w:val="single" w:color="8EAADB" w:sz="4"/>
+              <w:left w:val="single" w:color="8EAADB" w:sz="4"/>
+              <w:bottom w:val="single" w:color="8EAADB" w:sz="4"/>
+              <w:right w:val="single" w:color="8EAADB" w:sz="4"/>
+            </w:tcBorders>
+            <w:tcMar>
+              <w:top w:type="dxa" w:w="60"/>
+              <w:left w:type="dxa" w:w="100"/>
+              <w:bottom w:type="dxa" w:w="60"/>
+              <w:right w:type="dxa" w:w="100"/>
+            </w:tcMar>
+          </w:tcPr>
+          <w:p>
+            <w:pPr>
+              <w:spacing w:after="40"/>
+            </w:pPr>
+            <w:r>
+              <w:rPr>
+                <w:sz w:val="20"/>
+                <w:szCs w:val="20"/>
+              </w:rPr>
+              <w:t>HU-02, HU-03, HU-06 y HU-08 (validación formal pendiente al corte del 01/10), más dos tareas técnicas surgidas de las pruebas: seguridad de la API y recurso HL7 FHIR Patient.</w:t>
+            </w:r>
+          </w:p>
+        </w:tc>
+      </w:tr>
+      <w:tr>
+        <w:tc>
+          <w:tcPr>
+            <w:tcW w:type="dxa" w:w="2500"/>
+            <w:tcBorders>
+              <w:top w:val="single" w:color="8EAADB" w:sz="4"/>
+              <w:left w:val="single" w:color="8EAADB" w:sz="4"/>
+              <w:bottom w:val="single" w:color="8EAADB" w:sz="4"/>
+              <w:right w:val="single" w:color="8EAADB" w:sz="4"/>
+            </w:tcBorders>
+            <w:shd w:fill="F2F2F2" w:color="auto" w:val="clear"/>
+            <w:tcMar>
+              <w:top w:type="dxa" w:w="60"/>
+              <w:left w:type="dxa" w:w="100"/>
+              <w:bottom w:type="dxa" w:w="60"/>
+              <w:right w:type="dxa" w:w="100"/>
+            </w:tcMar>
+          </w:tcPr>
+          <w:p>
+            <w:pPr>
+              <w:spacing w:after="40"/>
+            </w:pPr>
+            <w:r>
+              <w:rPr>
+                <w:b/>
+                <w:bCs/>
+                <w:sz w:val="20"/>
+                <w:szCs w:val="20"/>
+              </w:rPr>
+              <w:t xml:space="preserve">Historias terminadas</w:t>
+            </w:r>
+          </w:p>
+        </w:tc>
+        <w:tc>
+          <w:tcPr>
+            <w:tcW w:type="dxa" w:w="6860"/>
+            <w:tcBorders>
+              <w:top w:val="single" w:color="8EAADB" w:sz="4"/>
+              <w:left w:val="single" w:color="8EAADB" w:sz="4"/>
+              <w:bottom w:val="single" w:color="8EAADB" w:sz="4"/>
+              <w:right w:val="single" w:color="8EAADB" w:sz="4"/>
+            </w:tcBorders>
+            <w:tcMar>
+              <w:top w:type="dxa" w:w="60"/>
+              <w:left w:type="dxa" w:w="100"/>
+              <w:bottom w:type="dxa" w:w="60"/>
+              <w:right w:type="dxa" w:w="100"/>
+            </w:tcMar>
+          </w:tcPr>
+          <w:p>
+            <w:pPr>
+              <w:spacing w:after="40"/>
+            </w:pPr>
+            <w:r>
+              <w:rPr>
+                <w:sz w:val="20"/>
+                <w:szCs w:val="20"/>
+              </w:rPr>
+              <w:t>HU-08 terminada: RUT seudonimizado (PU-03) y RLS en eventos, alertas y sensores (PI-03 y PI-03b).</w:t>
+            </w:r>
+            <w:r>
+              <w:rPr>
+                <w:b/>
+                <w:bCs/>
+                <w:sz w:val="20"/>
+                <w:szCs w:val="20"/>
+              </w:rPr>
+            </w:r>
+            <w:r>
+              <w:rPr>
+                <w:sz w:val="20"/>
+                <w:szCs w:val="20"/>
+              </w:rPr>
+            </w:r>
+          </w:p>
+          <w:p>
+            <w:pPr>
+              <w:spacing w:after="40"/>
+            </w:pPr>
+            <w:r>
+              <w:rPr>
+                <w:sz w:val="20"/>
+                <w:szCs w:val="20"/>
+              </w:rPr>
+              <w:t>HU-02 validada: 30 de 30 avisos ntfy recibidos en el celular (PR-02).</w:t>
+            </w:r>
+            <w:r>
+              <w:rPr>
+                <w:b/>
+                <w:bCs/>
+                <w:sz w:val="20"/>
+                <w:szCs w:val="20"/>
+              </w:rPr>
+            </w:r>
+            <w:r>
+              <w:rPr>
+                <w:sz w:val="20"/>
+                <w:szCs w:val="20"/>
+              </w:rPr>
+            </w:r>
+          </w:p>
+          <w:p>
+            <w:pPr>
+              <w:spacing w:after="40"/>
+            </w:pPr>
+            <w:r>
+              <w:rPr>
+                <w:sz w:val="20"/>
+                <w:szCs w:val="20"/>
+              </w:rPr>
+              <w:t>HU-06 reforzada: atender una alerta exige la sesión del cuidador y registra su correo en resuelto_por (PS-01b).</w:t>
+            </w:r>
+            <w:r>
+              <w:rPr>
+                <w:b/>
+                <w:bCs/>
+                <w:sz w:val="20"/>
+                <w:szCs w:val="20"/>
+              </w:rPr>
+            </w:r>
+            <w:r>
+              <w:rPr>
+                <w:sz w:val="20"/>
+                <w:szCs w:val="20"/>
+              </w:rPr>
+            </w:r>
+          </w:p>
+          <w:p>
+            <w:pPr>
+              <w:spacing w:after="40"/>
+            </w:pPr>
+            <w:r>
+              <w:rPr>
+                <w:sz w:val="20"/>
+                <w:szCs w:val="20"/>
+              </w:rPr>
+              <w:t>HU-03 reabierta: sin internet se guardaron y mostraron 10 de 10 caídas (PR-03), pero no se cumple el criterio de sincronizar el 100 % con Supabase al reconectar. Pasa al Sprint 4.</w:t>
+            </w:r>
+            <w:r>
+              <w:rPr>
+                <w:b/>
+                <w:bCs/>
+                <w:sz w:val="20"/>
+                <w:szCs w:val="20"/>
+              </w:rPr>
+            </w:r>
+            <w:r>
+              <w:rPr>
+                <w:sz w:val="20"/>
+                <w:szCs w:val="20"/>
+              </w:rPr>
+            </w:r>
+          </w:p>
+        </w:tc>
+      </w:tr>
+      <w:tr>
+        <w:tc>
+          <w:tcPr>
+            <w:tcW w:type="dxa" w:w="2500"/>
+            <w:tcBorders>
+              <w:top w:val="single" w:color="8EAADB" w:sz="4"/>
+              <w:left w:val="single" w:color="8EAADB" w:sz="4"/>
+              <w:bottom w:val="single" w:color="8EAADB" w:sz="4"/>
+              <w:right w:val="single" w:color="8EAADB" w:sz="4"/>
+            </w:tcBorders>
+            <w:shd w:fill="F2F2F2" w:color="auto" w:val="clear"/>
+            <w:tcMar>
+              <w:top w:type="dxa" w:w="60"/>
+              <w:left w:type="dxa" w:w="100"/>
+              <w:bottom w:type="dxa" w:w="60"/>
+              <w:right w:type="dxa" w:w="100"/>
+            </w:tcMar>
+          </w:tcPr>
+          <w:p>
+            <w:pPr>
+              <w:spacing w:after="40"/>
+            </w:pPr>
+            <w:r>
+              <w:rPr>
+                <w:b/>
+                <w:bCs/>
+                <w:sz w:val="20"/>
+                <w:szCs w:val="20"/>
+              </w:rPr>
+              <w:t xml:space="preserve">Funcionalidades implementadas</w:t>
+            </w:r>
+          </w:p>
+        </w:tc>
+        <w:tc>
+          <w:tcPr>
+            <w:tcW w:type="dxa" w:w="6860"/>
+            <w:tcBorders>
+              <w:top w:val="single" w:color="8EAADB" w:sz="4"/>
+              <w:left w:val="single" w:color="8EAADB" w:sz="4"/>
+              <w:bottom w:val="single" w:color="8EAADB" w:sz="4"/>
+              <w:right w:val="single" w:color="8EAADB" w:sz="4"/>
+            </w:tcBorders>
+            <w:tcMar>
+              <w:top w:type="dxa" w:w="60"/>
+              <w:left w:type="dxa" w:w="100"/>
+              <w:bottom w:type="dxa" w:w="60"/>
+              <w:right w:type="dxa" w:w="100"/>
+            </w:tcMar>
+          </w:tcPr>
+          <w:p>
+            <w:pPr>
+              <w:pStyle w:val="ListParagraph"/>
+              <w:numPr>
+                <w:ilvl w:val="0"/>
+                <w:numId w:val="2"/>
+              </w:numPr>
+              <w:spacing w:after="40"/>
+            </w:pPr>
+            <w:r>
+              <w:rPr>
+                <w:sz w:val="20"/>
+                <w:szCs w:val="20"/>
+              </w:rPr>
+              <w:t>Envío por WebSocket antes que ntfy y hora de Chile en los avisos (−17 % de latencia).</w:t>
+            </w:r>
+          </w:p>
+          <w:p>
+            <w:pPr>
+              <w:pStyle w:val="ListParagraph"/>
+              <w:numPr>
+                <w:ilvl w:val="0"/>
+                <w:numId w:val="2"/>
+              </w:numPr>
+              <w:spacing w:after="40"/>
+            </w:pPr>
+            <w:r>
+              <w:rPr>
+                <w:sz w:val="20"/>
+                <w:szCs w:val="20"/>
+              </w:rPr>
+              <w:t>HL7 FHIR R4: Observation y Bundle (02/10) y Patient seudonimizado con búsqueda por paciente (05/10).</w:t>
+            </w:r>
+          </w:p>
+          <w:p>
+            <w:pPr>
+              <w:pStyle w:val="ListParagraph"/>
+              <w:numPr>
+                <w:ilvl w:val="0"/>
+                <w:numId w:val="2"/>
+              </w:numPr>
+              <w:spacing w:after="40"/>
+            </w:pPr>
+            <w:r>
+              <w:rPr>
+                <w:sz w:val="20"/>
+                <w:szCs w:val="20"/>
+              </w:rPr>
+              <w:t>Regla de la puerta principal en el backend: alerta de noche (22:00–07:00) o si queda abierta 10 minutos o más.</w:t>
+            </w:r>
+          </w:p>
+          <w:p>
+            <w:pPr>
+              <w:pStyle w:val="ListParagraph"/>
+              <w:numPr>
+                <w:ilvl w:val="0"/>
+                <w:numId w:val="2"/>
+              </w:numPr>
+              <w:spacing w:after="40"/>
+            </w:pPr>
+            <w:r>
+              <w:rPr>
+                <w:sz w:val="20"/>
+                <w:szCs w:val="20"/>
+              </w:rPr>
+              <w:t>Seguridad: clave de API para los sensores (cabecera X-API-Key) e inicio de sesión del cuidador con Supabase Auth; RLS en la tabla sensores.</w:t>
+            </w:r>
+          </w:p>
+          <w:p>
+            <w:pPr>
+              <w:pStyle w:val="ListParagraph"/>
+              <w:numPr>
+                <w:ilvl w:val="0"/>
+                <w:numId w:val="2"/>
+              </w:numPr>
+              <w:spacing w:after="40"/>
+            </w:pPr>
+            <w:r>
+              <w:rPr>
+                <w:sz w:val="20"/>
+                <w:szCs w:val="20"/>
+              </w:rPr>
+              <w:t>Panel: componentes simulados identificados, base de datos en uso y hora de atención de cada alerta.</w:t>
+            </w:r>
+          </w:p>
+          <w:p>
+            <w:pPr>
+              <w:pStyle w:val="ListParagraph"/>
+              <w:numPr>
+                <w:ilvl w:val="0"/>
+                <w:numId w:val="2"/>
+              </w:numPr>
+              <w:spacing w:after="40"/>
+            </w:pPr>
+            <w:r>
+              <w:rPr>
+                <w:sz w:val="20"/>
+                <w:szCs w:val="20"/>
+              </w:rPr>
+              <w:t>Supabase: search_path fijo en dos funciones y eliminación de dos índices duplicados.</w:t>
+            </w:r>
+          </w:p>
+          <w:p>
+            <w:pPr>
+              <w:pStyle w:val="ListParagraph"/>
+              <w:numPr>
+                <w:ilvl w:val="0"/>
+                <w:numId w:val="2"/>
+              </w:numPr>
+              <w:spacing w:after="40"/>
+            </w:pPr>
+            <w:r>
+              <w:rPr>
+                <w:sz w:val="20"/>
+                <w:szCs w:val="20"/>
+              </w:rPr>
+              <w:t>README y .env.example reescritos según la guía de apoyo del proyecto.</w:t>
+            </w:r>
+          </w:p>
+        </w:tc>
+      </w:tr>
+      <w:tr>
+        <w:tc>
+          <w:tcPr>
+            <w:tcW w:type="dxa" w:w="2500"/>
+            <w:tcBorders>
+              <w:top w:val="single" w:color="8EAADB" w:sz="4"/>
+              <w:left w:val="single" w:color="8EAADB" w:sz="4"/>
+              <w:bottom w:val="single" w:color="8EAADB" w:sz="4"/>
+              <w:right w:val="single" w:color="8EAADB" w:sz="4"/>
+            </w:tcBorders>
+            <w:shd w:fill="F2F2F2" w:color="auto" w:val="clear"/>
+            <w:tcMar>
+              <w:top w:type="dxa" w:w="60"/>
+              <w:left w:type="dxa" w:w="100"/>
+              <w:bottom w:type="dxa" w:w="60"/>
+              <w:right w:type="dxa" w:w="100"/>
+            </w:tcMar>
+          </w:tcPr>
+          <w:p>
+            <w:pPr>
+              <w:spacing w:after="40"/>
+            </w:pPr>
+            <w:r>
+              <w:rPr>
+                <w:b/>
+                <w:bCs/>
+                <w:sz w:val="20"/>
+                <w:szCs w:val="20"/>
+              </w:rPr>
+              <w:t xml:space="preserve">Pruebas realizadas</w:t>
+            </w:r>
+          </w:p>
+        </w:tc>
+        <w:tc>
+          <w:tcPr>
+            <w:tcW w:type="dxa" w:w="6860"/>
+            <w:tcBorders>
+              <w:top w:val="single" w:color="8EAADB" w:sz="4"/>
+              <w:left w:val="single" w:color="8EAADB" w:sz="4"/>
+              <w:bottom w:val="single" w:color="8EAADB" w:sz="4"/>
+              <w:right w:val="single" w:color="8EAADB" w:sz="4"/>
+            </w:tcBorders>
+            <w:tcMar>
+              <w:top w:type="dxa" w:w="60"/>
+              <w:left w:type="dxa" w:w="100"/>
+              <w:bottom w:type="dxa" w:w="60"/>
+              <w:right w:type="dxa" w:w="100"/>
+            </w:tcMar>
+          </w:tcPr>
+          <w:p>
+            <w:pPr>
+              <w:pStyle w:val="ListParagraph"/>
+              <w:numPr>
+                <w:ilvl w:val="0"/>
+                <w:numId w:val="2"/>
+              </w:numPr>
+              <w:spacing w:after="40"/>
+            </w:pPr>
+            <w:r>
+              <w:rPr>
+                <w:sz w:val="20"/>
+                <w:szCs w:val="20"/>
+              </w:rPr>
+              <w:t>PU-03, PI-02, PI-03 y PI-04 aprobadas (02/10).</w:t>
+            </w:r>
+          </w:p>
+          <w:p>
+            <w:pPr>
+              <w:pStyle w:val="ListParagraph"/>
+              <w:numPr>
+                <w:ilvl w:val="0"/>
+                <w:numId w:val="2"/>
+              </w:numPr>
+              <w:spacing w:after="40"/>
+            </w:pPr>
+            <w:r>
+              <w:rPr>
+                <w:sz w:val="20"/>
+                <w:szCs w:val="20"/>
+              </w:rPr>
+              <w:t>PR-01 y PR-01b: 30/30 alertas por WebSocket; 1.577 ms en Render + Supabase y 216 ms en AWS EC2 (02/10).</w:t>
+            </w:r>
+          </w:p>
+          <w:p>
+            <w:pPr>
+              <w:pStyle w:val="ListParagraph"/>
+              <w:numPr>
+                <w:ilvl w:val="0"/>
+                <w:numId w:val="2"/>
+              </w:numPr>
+              <w:spacing w:after="40"/>
+            </w:pPr>
+            <w:r>
+              <w:rPr>
+                <w:sz w:val="20"/>
+                <w:szCs w:val="20"/>
+              </w:rPr>
+              <w:t>PR-02: 30/30 notificaciones en el celular; PR-03: 10/10 caídas sin internet (03/10).</w:t>
+            </w:r>
+          </w:p>
+          <w:p>
+            <w:pPr>
+              <w:pStyle w:val="ListParagraph"/>
+              <w:numPr>
+                <w:ilvl w:val="0"/>
+                <w:numId w:val="2"/>
+              </w:numPr>
+              <w:spacing w:after="40"/>
+            </w:pPr>
+            <w:r>
+              <w:rPr>
+                <w:sz w:val="20"/>
+                <w:szCs w:val="20"/>
+              </w:rPr>
+              <w:t>PU-04: 10/10; PI-05: 8/8; PS-01: 7/7 unitaria y 3/3 en producción; PS-01b: 7/7 unitaria y 3/3 en producción; PI-03b: 0 filas para el rol anónimo (05/10).</w:t>
+            </w:r>
+          </w:p>
+        </w:tc>
+      </w:tr>
+      <w:tr>
+        <w:tc>
+          <w:tcPr>
+            <w:tcW w:type="dxa" w:w="2500"/>
+            <w:tcBorders>
+              <w:top w:val="single" w:color="8EAADB" w:sz="4"/>
+              <w:left w:val="single" w:color="8EAADB" w:sz="4"/>
+              <w:bottom w:val="single" w:color="8EAADB" w:sz="4"/>
+              <w:right w:val="single" w:color="8EAADB" w:sz="4"/>
+            </w:tcBorders>
+            <w:shd w:fill="F2F2F2" w:color="auto" w:val="clear"/>
+            <w:tcMar>
+              <w:top w:type="dxa" w:w="60"/>
+              <w:left w:type="dxa" w:w="100"/>
+              <w:bottom w:type="dxa" w:w="60"/>
+              <w:right w:type="dxa" w:w="100"/>
+            </w:tcMar>
+          </w:tcPr>
+          <w:p>
+            <w:pPr>
+              <w:spacing w:after="40"/>
+            </w:pPr>
+            <w:r>
+              <w:rPr>
+                <w:b/>
+                <w:bCs/>
+                <w:sz w:val="20"/>
+                <w:szCs w:val="20"/>
+              </w:rPr>
+              <w:t xml:space="preserve">Evidencias</w:t>
+            </w:r>
+          </w:p>
+        </w:tc>
+        <w:tc>
+          <w:tcPr>
+            <w:tcW w:type="dxa" w:w="6860"/>
+            <w:tcBorders>
+              <w:top w:val="single" w:color="8EAADB" w:sz="4"/>
+              <w:left w:val="single" w:color="8EAADB" w:sz="4"/>
+              <w:bottom w:val="single" w:color="8EAADB" w:sz="4"/>
+              <w:right w:val="single" w:color="8EAADB" w:sz="4"/>
+            </w:tcBorders>
+            <w:tcMar>
+              <w:top w:type="dxa" w:w="60"/>
+              <w:left w:type="dxa" w:w="100"/>
+              <w:bottom w:type="dxa" w:w="60"/>
+              <w:right w:type="dxa" w:w="100"/>
+            </w:tcMar>
+          </w:tcPr>
+          <w:p>
+            <w:pPr>
+              <w:pStyle w:val="ListParagraph"/>
+              <w:numPr>
+                <w:ilvl w:val="0"/>
+                <w:numId w:val="2"/>
+              </w:numPr>
+              <w:spacing w:after="40"/>
+            </w:pPr>
+            <w:r>
+              <w:rPr>
+                <w:sz w:val="20"/>
+                <w:szCs w:val="20"/>
+              </w:rPr>
+              <w:t>Commits 1c8c203, 1da626e y 8a15d5e (02/10): ajuste de latencia, FHIR y pruebas iniciales.</w:t>
+            </w:r>
+          </w:p>
+          <w:p>
+            <w:pPr>
+              <w:pStyle w:val="ListParagraph"/>
+              <w:numPr>
+                <w:ilvl w:val="0"/>
+                <w:numId w:val="2"/>
+              </w:numPr>
+              <w:spacing w:after="40"/>
+            </w:pPr>
+            <w:r>
+              <w:rPr>
+                <w:sz w:val="20"/>
+                <w:szCs w:val="20"/>
+              </w:rPr>
+              <w:t>Commits 032f475 y b34bda0 (03/10): pruebas PR-02 y PR-03.</w:t>
+            </w:r>
+          </w:p>
+          <w:p>
+            <w:pPr>
+              <w:pStyle w:val="ListParagraph"/>
+              <w:numPr>
+                <w:ilvl w:val="0"/>
+                <w:numId w:val="2"/>
+              </w:numPr>
+              <w:spacing w:after="40"/>
+            </w:pPr>
+            <w:r>
+              <w:rPr>
+                <w:sz w:val="20"/>
+                <w:szCs w:val="20"/>
+              </w:rPr>
+              <w:t>Commits bc31fb5, d7a2c88, 1688327, b23df2f, 0f01d89 y dd5d23c (05/10): panel, regla de la puerta, seguridad y FHIR Patient.</w:t>
+            </w:r>
+          </w:p>
+          <w:p>
+            <w:pPr>
+              <w:pStyle w:val="ListParagraph"/>
+              <w:numPr>
+                <w:ilvl w:val="0"/>
+                <w:numId w:val="2"/>
+              </w:numPr>
+              <w:spacing w:after="40"/>
+            </w:pPr>
+            <w:r>
+              <w:rPr>
+                <w:sz w:val="20"/>
+                <w:szCs w:val="20"/>
+              </w:rPr>
+              <w:t>Commits e7a85d5, 52f2f36 y 8338d7b (05–06/10): README, Guía 2.4 y correcciones en Supabase.</w:t>
+            </w:r>
+          </w:p>
+          <w:p>
+            <w:pPr>
+              <w:pStyle w:val="ListParagraph"/>
+              <w:numPr>
+                <w:ilvl w:val="0"/>
+                <w:numId w:val="2"/>
+              </w:numPr>
+              <w:spacing w:after="40"/>
+            </w:pPr>
+            <w:r>
+              <w:rPr>
+                <w:sz w:val="20"/>
+                <w:szCs w:val="20"/>
+              </w:rPr>
+              <w:t>Registro de pruebas y capturas en docs/fase2/evidencias_proyecto/documentacion.</w:t>
+            </w:r>
+          </w:p>
+        </w:tc>
+      </w:tr>
+      <w:tr>
+        <w:tc>
+          <w:tcPr>
+            <w:tcW w:type="dxa" w:w="2500"/>
+            <w:tcBorders>
+              <w:top w:val="single" w:color="8EAADB" w:sz="4"/>
+              <w:left w:val="single" w:color="8EAADB" w:sz="4"/>
+              <w:bottom w:val="single" w:color="8EAADB" w:sz="4"/>
+              <w:right w:val="single" w:color="8EAADB" w:sz="4"/>
+            </w:tcBorders>
+            <w:shd w:fill="F2F2F2" w:color="auto" w:val="clear"/>
+            <w:tcMar>
+              <w:top w:type="dxa" w:w="60"/>
+              <w:left w:type="dxa" w:w="100"/>
+              <w:bottom w:type="dxa" w:w="60"/>
+              <w:right w:type="dxa" w:w="100"/>
+            </w:tcMar>
+          </w:tcPr>
+          <w:p>
+            <w:pPr>
+              <w:spacing w:after="40"/>
+            </w:pPr>
+            <w:r>
+              <w:rPr>
+                <w:b/>
+                <w:bCs/>
+                <w:sz w:val="20"/>
+                <w:szCs w:val="20"/>
+              </w:rPr>
+              <w:t xml:space="preserve">Problemas encontrados</w:t>
+            </w:r>
+          </w:p>
+        </w:tc>
+        <w:tc>
+          <w:tcPr>
+            <w:tcW w:type="dxa" w:w="6860"/>
+            <w:tcBorders>
+              <w:top w:val="single" w:color="8EAADB" w:sz="4"/>
+              <w:left w:val="single" w:color="8EAADB" w:sz="4"/>
+              <w:bottom w:val="single" w:color="8EAADB" w:sz="4"/>
+              <w:right w:val="single" w:color="8EAADB" w:sz="4"/>
+            </w:tcBorders>
+            <w:tcMar>
+              <w:top w:type="dxa" w:w="60"/>
+              <w:left w:type="dxa" w:w="100"/>
+              <w:bottom w:type="dxa" w:w="60"/>
+              <w:right w:type="dxa" w:w="100"/>
+            </w:tcMar>
+          </w:tcPr>
+          <w:p>
+            <w:pPr>
+              <w:pStyle w:val="ListParagraph"/>
+              <w:numPr>
+                <w:ilvl w:val="0"/>
+                <w:numId w:val="2"/>
+              </w:numPr>
+              <w:spacing w:after="40"/>
+            </w:pPr>
+            <w:r>
+              <w:rPr>
+                <w:sz w:val="20"/>
+                <w:szCs w:val="20"/>
+              </w:rPr>
+              <w:t>Oracle Cloud Santiago no tenía capacidad para las máquinas gratuitas (03 y 05/10).</w:t>
+            </w:r>
+          </w:p>
+          <w:p>
+            <w:pPr>
+              <w:pStyle w:val="ListParagraph"/>
+              <w:numPr>
+                <w:ilvl w:val="0"/>
+                <w:numId w:val="2"/>
+              </w:numPr>
+              <w:spacing w:after="40"/>
+            </w:pPr>
+            <w:r>
+              <w:rPr>
+                <w:sz w:val="20"/>
+                <w:szCs w:val="20"/>
+              </w:rPr>
+              <w:t>navigator.onLine no detecta el corte de internet en Windows, lo que invalidó una corrida de PR-03.</w:t>
+            </w:r>
+          </w:p>
+          <w:p>
+            <w:pPr>
+              <w:pStyle w:val="ListParagraph"/>
+              <w:numPr>
+                <w:ilvl w:val="0"/>
+                <w:numId w:val="2"/>
+              </w:numPr>
+              <w:spacing w:after="40"/>
+            </w:pPr>
+            <w:r>
+              <w:rPr>
+                <w:sz w:val="20"/>
+                <w:szCs w:val="20"/>
+              </w:rPr>
+              <w:t>Al activar la clave de API, la clave guardada no coincidía con la del servidor (40 frente a 43 caracteres) y una clave quedó expuesta durante la depuración; el portapapeles de PowerShell no funcionó de forma confiable.</w:t>
+            </w:r>
+          </w:p>
+          <w:p>
+            <w:pPr>
+              <w:pStyle w:val="ListParagraph"/>
+              <w:numPr>
+                <w:ilvl w:val="0"/>
+                <w:numId w:val="2"/>
+              </w:numPr>
+              <w:spacing w:after="40"/>
+            </w:pPr>
+            <w:r>
+              <w:rPr>
+                <w:sz w:val="20"/>
+                <w:szCs w:val="20"/>
+              </w:rPr>
+              <w:t>El Security Advisor de Supabase detectó la tabla sensores sin RLS, dos funciones con search_path mutable y un índice duplicado.</w:t>
+            </w:r>
+          </w:p>
+        </w:tc>
+      </w:tr>
+      <w:tr>
+        <w:tc>
+          <w:tcPr>
+            <w:tcW w:type="dxa" w:w="2500"/>
+            <w:tcBorders>
+              <w:top w:val="single" w:color="8EAADB" w:sz="4"/>
+              <w:left w:val="single" w:color="8EAADB" w:sz="4"/>
+              <w:bottom w:val="single" w:color="8EAADB" w:sz="4"/>
+              <w:right w:val="single" w:color="8EAADB" w:sz="4"/>
+            </w:tcBorders>
+            <w:shd w:fill="F2F2F2" w:color="auto" w:val="clear"/>
+            <w:tcMar>
+              <w:top w:type="dxa" w:w="60"/>
+              <w:left w:type="dxa" w:w="100"/>
+              <w:bottom w:type="dxa" w:w="60"/>
+              <w:right w:type="dxa" w:w="100"/>
+            </w:tcMar>
+          </w:tcPr>
+          <w:p>
+            <w:pPr>
+              <w:spacing w:after="40"/>
+            </w:pPr>
+            <w:r>
+              <w:rPr>
+                <w:b/>
+                <w:bCs/>
+                <w:sz w:val="20"/>
+                <w:szCs w:val="20"/>
+              </w:rPr>
+              <w:t xml:space="preserve">Acciones tomadas</w:t>
+            </w:r>
+          </w:p>
+        </w:tc>
+        <w:tc>
+          <w:tcPr>
+            <w:tcW w:type="dxa" w:w="6860"/>
+            <w:tcBorders>
+              <w:top w:val="single" w:color="8EAADB" w:sz="4"/>
+              <w:left w:val="single" w:color="8EAADB" w:sz="4"/>
+              <w:bottom w:val="single" w:color="8EAADB" w:sz="4"/>
+              <w:right w:val="single" w:color="8EAADB" w:sz="4"/>
+            </w:tcBorders>
+            <w:tcMar>
+              <w:top w:type="dxa" w:w="60"/>
+              <w:left w:type="dxa" w:w="100"/>
+              <w:bottom w:type="dxa" w:w="60"/>
+              <w:right w:type="dxa" w:w="100"/>
+            </w:tcMar>
+          </w:tcPr>
+          <w:p>
+            <w:pPr>
+              <w:pStyle w:val="ListParagraph"/>
+              <w:numPr>
+                <w:ilvl w:val="0"/>
+                <w:numId w:val="2"/>
+              </w:numPr>
+              <w:spacing w:after="40"/>
+            </w:pPr>
+            <w:r>
+              <w:rPr>
+                <w:sz w:val="20"/>
+                <w:szCs w:val="20"/>
+              </w:rPr>
+              <w:t>Despliegue en Oracle postergado; se mantiene AWS EC2 como entorno de comparación.</w:t>
+            </w:r>
+          </w:p>
+          <w:p>
+            <w:pPr>
+              <w:pStyle w:val="ListParagraph"/>
+              <w:numPr>
+                <w:ilvl w:val="0"/>
+                <w:numId w:val="2"/>
+              </w:numPr>
+              <w:spacing w:after="40"/>
+            </w:pPr>
+            <w:r>
+              <w:rPr>
+                <w:sz w:val="20"/>
+                <w:szCs w:val="20"/>
+              </w:rPr>
+              <w:t>El script de PR-03 comprueba el corte con una consulta a ntfy.sh en lugar de navigator.onLine.</w:t>
+            </w:r>
+          </w:p>
+          <w:p>
+            <w:pPr>
+              <w:pStyle w:val="ListParagraph"/>
+              <w:numPr>
+                <w:ilvl w:val="0"/>
+                <w:numId w:val="2"/>
+              </w:numPr>
+              <w:spacing w:after="40"/>
+            </w:pPr>
+            <w:r>
+              <w:rPr>
+                <w:sz w:val="20"/>
+                <w:szCs w:val="20"/>
+              </w:rPr>
+              <w:t>Diagnóstico con una huella SHA-256 parcial publicada en /api/health, clave expuesta descartada y clave nueva generada directamente en un archivo fuera del repositorio.</w:t>
+            </w:r>
+          </w:p>
+          <w:p>
+            <w:pPr>
+              <w:pStyle w:val="ListParagraph"/>
+              <w:numPr>
+                <w:ilvl w:val="0"/>
+                <w:numId w:val="2"/>
+              </w:numPr>
+              <w:spacing w:after="40"/>
+            </w:pPr>
+            <w:r>
+              <w:rPr>
+                <w:sz w:val="20"/>
+                <w:szCs w:val="20"/>
+              </w:rPr>
+              <w:t>RLS activado en sensores el mismo día (PI-03b); search_path e índices corregidos el 06/10.</w:t>
+            </w:r>
+          </w:p>
+        </w:tc>
+      </w:tr>
+      <w:tr>
+        <w:tc>
+          <w:tcPr>
+            <w:tcW w:type="dxa" w:w="2500"/>
+            <w:tcBorders>
+              <w:top w:val="single" w:color="8EAADB" w:sz="4"/>
+              <w:left w:val="single" w:color="8EAADB" w:sz="4"/>
+              <w:bottom w:val="single" w:color="8EAADB" w:sz="4"/>
+              <w:right w:val="single" w:color="8EAADB" w:sz="4"/>
+            </w:tcBorders>
+            <w:shd w:fill="F2F2F2" w:color="auto" w:val="clear"/>
+            <w:tcMar>
+              <w:top w:type="dxa" w:w="60"/>
+              <w:left w:type="dxa" w:w="100"/>
+              <w:bottom w:type="dxa" w:w="60"/>
+              <w:right w:type="dxa" w:w="100"/>
+            </w:tcMar>
+          </w:tcPr>
+          <w:p>
+            <w:pPr>
+              <w:spacing w:after="40"/>
+            </w:pPr>
+            <w:r>
+              <w:rPr>
+                <w:b/>
+                <w:bCs/>
+                <w:sz w:val="20"/>
+                <w:szCs w:val="20"/>
+              </w:rPr>
+              <w:t xml:space="preserve">Pendientes</w:t>
+            </w:r>
+          </w:p>
+        </w:tc>
+        <w:tc>
+          <w:tcPr>
+            <w:tcW w:type="dxa" w:w="6860"/>
+            <w:tcBorders>
+              <w:top w:val="single" w:color="8EAADB" w:sz="4"/>
+              <w:left w:val="single" w:color="8EAADB" w:sz="4"/>
+              <w:bottom w:val="single" w:color="8EAADB" w:sz="4"/>
+              <w:right w:val="single" w:color="8EAADB" w:sz="4"/>
+            </w:tcBorders>
+            <w:tcMar>
+              <w:top w:type="dxa" w:w="60"/>
+              <w:left w:type="dxa" w:w="100"/>
+              <w:bottom w:type="dxa" w:w="60"/>
+              <w:right w:type="dxa" w:w="100"/>
+            </w:tcMar>
+          </w:tcPr>
+          <w:p>
+            <w:pPr>
+              <w:pStyle w:val="ListParagraph"/>
+              <w:numPr>
+                <w:ilvl w:val="0"/>
+                <w:numId w:val="2"/>
+              </w:numPr>
+              <w:spacing w:after="40"/>
+            </w:pPr>
+            <w:r>
+              <w:rPr>
+                <w:sz w:val="20"/>
+                <w:szCs w:val="20"/>
+              </w:rPr>
+              <w:t>HU-03: sincronización de los eventos del modo borde con Supabase al volver la conexión → Sprint 4.</w:t>
+            </w:r>
+          </w:p>
+          <w:p>
+            <w:pPr>
+              <w:pStyle w:val="ListParagraph"/>
+              <w:numPr>
+                <w:ilvl w:val="0"/>
+                <w:numId w:val="2"/>
+              </w:numPr>
+              <w:spacing w:after="40"/>
+            </w:pPr>
+            <w:r>
+              <w:rPr>
+                <w:sz w:val="20"/>
+                <w:szCs w:val="20"/>
+              </w:rPr>
+              <w:t>Protección de las consultas de lectura de la API → Sprint 4.</w:t>
+            </w:r>
+          </w:p>
+          <w:p>
+            <w:pPr>
+              <w:pStyle w:val="ListParagraph"/>
+              <w:numPr>
+                <w:ilvl w:val="0"/>
+                <w:numId w:val="2"/>
+              </w:numPr>
+              <w:spacing w:after="40"/>
+            </w:pPr>
+            <w:r>
+              <w:rPr>
+                <w:sz w:val="20"/>
+                <w:szCs w:val="20"/>
+              </w:rPr>
+              <w:t>Despliegue en Oracle Cloud Santiago → cuando haya capacidad.</w:t>
+            </w:r>
+          </w:p>
+          <w:p>
+            <w:pPr>
+              <w:pStyle w:val="ListParagraph"/>
+              <w:numPr>
+                <w:ilvl w:val="0"/>
+                <w:numId w:val="2"/>
+              </w:numPr>
+              <w:spacing w:after="40"/>
+            </w:pPr>
+            <w:r>
+              <w:rPr>
+                <w:sz w:val="20"/>
+                <w:szCs w:val="20"/>
+              </w:rPr>
+              <w:t>PR-04 (carga con Locust) → Sprint 5; HU-12 (Escala SUS) → Sprint 6.</w:t>
+            </w:r>
+          </w:p>
+          <w:p>
+            <w:pPr>
+              <w:pStyle w:val="ListParagraph"/>
+              <w:numPr>
+                <w:ilvl w:val="0"/>
+                <w:numId w:val="2"/>
+              </w:numPr>
+              <w:spacing w:after="40"/>
+            </w:pPr>
+            <w:r>
+              <w:rPr>
+                <w:sz w:val="20"/>
+                <w:szCs w:val="20"/>
+              </w:rPr>
+              <w:t>Matriz de trazabilidad, Product Vision, diagramas UML y manual técnico según la guía de apoyo del proyecto.</w:t>
+            </w:r>
+          </w:p>
+        </w:tc>
+      </w:tr>
+    </w:tbl>
+    <w:p>
+      <w:pPr>
+        <w:pStyle w:val="Heading2"/>
+      </w:pPr>
+      <w:r>
+        <w:t>Retrospectiva del Sprint 3 (actualización al 6 de octubre)</w:t>
+      </w:r>
+    </w:p>
+    <w:tbl>
+      <w:tblPr>
+        <w:tblW w:type="dxa" w:w="9360"/>
+        <w:tblBorders>
+          <w:top w:val="single" w:color="auto" w:sz="4"/>
+          <w:left w:val="single" w:color="auto" w:sz="4"/>
+          <w:bottom w:val="single" w:color="auto" w:sz="4"/>
+          <w:right w:val="single" w:color="auto" w:sz="4"/>
+          <w:insideH w:val="single" w:color="auto" w:sz="4"/>
+          <w:insideV w:val="single" w:color="auto" w:sz="4"/>
+        </w:tblBorders>
+      </w:tblPr>
+      <w:tblGrid>
+        <w:gridCol w:w="2500"/>
+        <w:gridCol w:w="6860"/>
+      </w:tblGrid>
+      <w:tr>
+        <w:trPr>
+          <w:tblHeader/>
+        </w:trPr>
+        <w:tc>
+          <w:tcPr>
+            <w:tcW w:type="dxa" w:w="2500"/>
+            <w:tcBorders>
+              <w:top w:val="single" w:color="8EAADB" w:sz="4"/>
+              <w:left w:val="single" w:color="8EAADB" w:sz="4"/>
+              <w:bottom w:val="single" w:color="8EAADB" w:sz="4"/>
+              <w:right w:val="single" w:color="8EAADB" w:sz="4"/>
+            </w:tcBorders>
+            <w:shd w:fill="2F5496" w:color="auto" w:val="clear"/>
+            <w:tcMar>
+              <w:top w:type="dxa" w:w="60"/>
+              <w:left w:type="dxa" w:w="100"/>
+              <w:bottom w:type="dxa" w:w="60"/>
+              <w:right w:type="dxa" w:w="100"/>
+            </w:tcMar>
+          </w:tcPr>
+          <w:p>
+            <w:r>
+              <w:rPr>
+                <w:b/>
+                <w:bCs/>
+                <w:color w:val="FFFFFF"/>
+                <w:sz w:val="20"/>
+                <w:szCs w:val="20"/>
+              </w:rPr>
+              <w:t xml:space="preserve">Campo</w:t>
+            </w:r>
+          </w:p>
+        </w:tc>
+        <w:tc>
+          <w:tcPr>
+            <w:tcW w:type="dxa" w:w="6860"/>
+            <w:tcBorders>
+              <w:top w:val="single" w:color="8EAADB" w:sz="4"/>
+              <w:left w:val="single" w:color="8EAADB" w:sz="4"/>
+              <w:bottom w:val="single" w:color="8EAADB" w:sz="4"/>
+              <w:right w:val="single" w:color="8EAADB" w:sz="4"/>
+            </w:tcBorders>
+            <w:shd w:fill="2F5496" w:color="auto" w:val="clear"/>
+            <w:tcMar>
+              <w:top w:type="dxa" w:w="60"/>
+              <w:left w:type="dxa" w:w="100"/>
+              <w:bottom w:type="dxa" w:w="60"/>
+              <w:right w:type="dxa" w:w="100"/>
+            </w:tcMar>
+          </w:tcPr>
+          <w:p>
+            <w:r>
+              <w:rPr>
+                <w:b/>
+                <w:bCs/>
+                <w:color w:val="FFFFFF"/>
+                <w:sz w:val="20"/>
+                <w:szCs w:val="20"/>
+              </w:rPr>
+              <w:t xml:space="preserve">Contenido</w:t>
+            </w:r>
+          </w:p>
+        </w:tc>
+      </w:tr>
+      <w:tr>
+        <w:tc>
+          <w:tcPr>
+            <w:tcW w:type="dxa" w:w="2500"/>
+            <w:tcBorders>
+              <w:top w:val="single" w:color="8EAADB" w:sz="4"/>
+              <w:left w:val="single" w:color="8EAADB" w:sz="4"/>
+              <w:bottom w:val="single" w:color="8EAADB" w:sz="4"/>
+              <w:right w:val="single" w:color="8EAADB" w:sz="4"/>
+            </w:tcBorders>
+            <w:shd w:fill="F2F2F2" w:color="auto" w:val="clear"/>
+            <w:tcMar>
+              <w:top w:type="dxa" w:w="60"/>
+              <w:left w:type="dxa" w:w="100"/>
+              <w:bottom w:type="dxa" w:w="60"/>
+              <w:right w:type="dxa" w:w="100"/>
+            </w:tcMar>
+          </w:tcPr>
+          <w:p>
+            <w:pPr>
+              <w:spacing w:after="40"/>
+            </w:pPr>
+            <w:r>
+              <w:rPr>
+                <w:b/>
+                <w:bCs/>
+                <w:sz w:val="20"/>
+                <w:szCs w:val="20"/>
+              </w:rPr>
+              <w:t xml:space="preserve">Verificación de la acción anterior</w:t>
+            </w:r>
+          </w:p>
+        </w:tc>
+        <w:tc>
+          <w:tcPr>
+            <w:tcW w:type="dxa" w:w="6860"/>
+            <w:tcBorders>
+              <w:top w:val="single" w:color="8EAADB" w:sz="4"/>
+              <w:left w:val="single" w:color="8EAADB" w:sz="4"/>
+              <w:bottom w:val="single" w:color="8EAADB" w:sz="4"/>
+              <w:right w:val="single" w:color="8EAADB" w:sz="4"/>
+            </w:tcBorders>
+            <w:tcMar>
+              <w:top w:type="dxa" w:w="60"/>
+              <w:left w:type="dxa" w:w="100"/>
+              <w:bottom w:type="dxa" w:w="60"/>
+              <w:right w:type="dxa" w:w="100"/>
+            </w:tcMar>
+          </w:tcPr>
+          <w:p>
+            <w:pPr>
+              <w:spacing w:after="40"/>
+            </w:pPr>
+            <w:r>
+              <w:rPr>
+                <w:sz w:val="20"/>
+                <w:szCs w:val="20"/>
+              </w:rPr>
+              <w:t>Acción del Sprint 3 (parcial): revisar Vercel y Render después de cada git push. Se cumplió: después de cada push se verificó /api/health y el panel publicado, lo que permitió detectar en minutos que la clave de API no coincidía. Efecto: ningún despliegue fallido quedó sin detectar.</w:t>
+            </w:r>
+            <w:r>
+              <w:rPr>
+                <w:b/>
+                <w:bCs/>
+                <w:sz w:val="20"/>
+                <w:szCs w:val="20"/>
+              </w:rPr>
+            </w:r>
+            <w:r>
+              <w:rPr>
+                <w:sz w:val="20"/>
+                <w:szCs w:val="20"/>
+              </w:rPr>
+            </w:r>
+          </w:p>
+        </w:tc>
+      </w:tr>
+      <w:tr>
+        <w:tc>
+          <w:tcPr>
+            <w:tcW w:type="dxa" w:w="2500"/>
+            <w:tcBorders>
+              <w:top w:val="single" w:color="8EAADB" w:sz="4"/>
+              <w:left w:val="single" w:color="8EAADB" w:sz="4"/>
+              <w:bottom w:val="single" w:color="8EAADB" w:sz="4"/>
+              <w:right w:val="single" w:color="8EAADB" w:sz="4"/>
+            </w:tcBorders>
+            <w:shd w:fill="F2F2F2" w:color="auto" w:val="clear"/>
+            <w:tcMar>
+              <w:top w:type="dxa" w:w="60"/>
+              <w:left w:type="dxa" w:w="100"/>
+              <w:bottom w:type="dxa" w:w="60"/>
+              <w:right w:type="dxa" w:w="100"/>
+            </w:tcMar>
+          </w:tcPr>
+          <w:p>
+            <w:pPr>
+              <w:spacing w:after="40"/>
+            </w:pPr>
+            <w:r>
+              <w:rPr>
+                <w:b/>
+                <w:bCs/>
+                <w:sz w:val="20"/>
+                <w:szCs w:val="20"/>
+              </w:rPr>
+              <w:t xml:space="preserve">¿Qué funcionó bien?</w:t>
+            </w:r>
+          </w:p>
+        </w:tc>
+        <w:tc>
+          <w:tcPr>
+            <w:tcW w:type="dxa" w:w="6860"/>
+            <w:tcBorders>
+              <w:top w:val="single" w:color="8EAADB" w:sz="4"/>
+              <w:left w:val="single" w:color="8EAADB" w:sz="4"/>
+              <w:bottom w:val="single" w:color="8EAADB" w:sz="4"/>
+              <w:right w:val="single" w:color="8EAADB" w:sz="4"/>
+            </w:tcBorders>
+            <w:tcMar>
+              <w:top w:type="dxa" w:w="60"/>
+              <w:left w:type="dxa" w:w="100"/>
+              <w:bottom w:type="dxa" w:w="60"/>
+              <w:right w:type="dxa" w:w="100"/>
+            </w:tcMar>
+          </w:tcPr>
+          <w:p>
+            <w:pPr>
+              <w:spacing w:after="40"/>
+            </w:pPr>
+            <w:r>
+              <w:rPr>
+                <w:sz w:val="20"/>
+                <w:szCs w:val="20"/>
+              </w:rPr>
+              <w:t>Las pruebas se ejecutaron contra el sistema publicado con scripts versionados, y los resultados quedaron registrados el mismo día. Comparar huellas SHA-256 permitió diagnosticar la clave sin mostrarla.</w:t>
+            </w:r>
+          </w:p>
+        </w:tc>
+      </w:tr>
+      <w:tr>
+        <w:tc>
+          <w:tcPr>
+            <w:tcW w:type="dxa" w:w="2500"/>
+            <w:tcBorders>
+              <w:top w:val="single" w:color="8EAADB" w:sz="4"/>
+              <w:left w:val="single" w:color="8EAADB" w:sz="4"/>
+              <w:bottom w:val="single" w:color="8EAADB" w:sz="4"/>
+              <w:right w:val="single" w:color="8EAADB" w:sz="4"/>
+            </w:tcBorders>
+            <w:shd w:fill="F2F2F2" w:color="auto" w:val="clear"/>
+            <w:tcMar>
+              <w:top w:type="dxa" w:w="60"/>
+              <w:left w:type="dxa" w:w="100"/>
+              <w:bottom w:type="dxa" w:w="60"/>
+              <w:right w:type="dxa" w:w="100"/>
+            </w:tcMar>
+          </w:tcPr>
+          <w:p>
+            <w:pPr>
+              <w:spacing w:after="40"/>
+            </w:pPr>
+            <w:r>
+              <w:rPr>
+                <w:b/>
+                <w:bCs/>
+                <w:sz w:val="20"/>
+                <w:szCs w:val="20"/>
+              </w:rPr>
+              <w:t xml:space="preserve">¿Qué problemas tuvimos?</w:t>
+            </w:r>
+          </w:p>
+        </w:tc>
+        <w:tc>
+          <w:tcPr>
+            <w:tcW w:type="dxa" w:w="6860"/>
+            <w:tcBorders>
+              <w:top w:val="single" w:color="8EAADB" w:sz="4"/>
+              <w:left w:val="single" w:color="8EAADB" w:sz="4"/>
+              <w:bottom w:val="single" w:color="8EAADB" w:sz="4"/>
+              <w:right w:val="single" w:color="8EAADB" w:sz="4"/>
+            </w:tcBorders>
+            <w:tcMar>
+              <w:top w:type="dxa" w:w="60"/>
+              <w:left w:type="dxa" w:w="100"/>
+              <w:bottom w:type="dxa" w:w="60"/>
+              <w:right w:type="dxa" w:w="100"/>
+            </w:tcMar>
+          </w:tcPr>
+          <w:p>
+            <w:pPr>
+              <w:spacing w:after="40"/>
+            </w:pPr>
+            <w:r>
+              <w:rPr>
+                <w:sz w:val="20"/>
+                <w:szCs w:val="20"/>
+              </w:rPr>
+              <w:t>Tiempo perdido al copiar y pegar claves entre aplicaciones, con una clave expuesta; la sincronización del modo borde no estaba implementada aunque HU-03 figuraba como terminada; dependencia de la capacidad de Oracle.</w:t>
+            </w:r>
+          </w:p>
+        </w:tc>
+      </w:tr>
+      <w:tr>
+        <w:tc>
+          <w:tcPr>
+            <w:tcW w:type="dxa" w:w="2500"/>
+            <w:tcBorders>
+              <w:top w:val="single" w:color="8EAADB" w:sz="4"/>
+              <w:left w:val="single" w:color="8EAADB" w:sz="4"/>
+              <w:bottom w:val="single" w:color="8EAADB" w:sz="4"/>
+              <w:right w:val="single" w:color="8EAADB" w:sz="4"/>
+            </w:tcBorders>
+            <w:shd w:fill="F2F2F2" w:color="auto" w:val="clear"/>
+            <w:tcMar>
+              <w:top w:type="dxa" w:w="60"/>
+              <w:left w:type="dxa" w:w="100"/>
+              <w:bottom w:type="dxa" w:w="60"/>
+              <w:right w:type="dxa" w:w="100"/>
+            </w:tcMar>
+          </w:tcPr>
+          <w:p>
+            <w:pPr>
+              <w:spacing w:after="40"/>
+            </w:pPr>
+            <w:r>
+              <w:rPr>
+                <w:b/>
+                <w:bCs/>
+                <w:sz w:val="20"/>
+                <w:szCs w:val="20"/>
+              </w:rPr>
+              <w:t xml:space="preserve">¿Qué vamos a cambiar?</w:t>
+            </w:r>
+          </w:p>
+        </w:tc>
+        <w:tc>
+          <w:tcPr>
+            <w:tcW w:type="dxa" w:w="6860"/>
+            <w:tcBorders>
+              <w:top w:val="single" w:color="8EAADB" w:sz="4"/>
+              <w:left w:val="single" w:color="8EAADB" w:sz="4"/>
+              <w:bottom w:val="single" w:color="8EAADB" w:sz="4"/>
+              <w:right w:val="single" w:color="8EAADB" w:sz="4"/>
+            </w:tcBorders>
+            <w:tcMar>
+              <w:top w:type="dxa" w:w="60"/>
+              <w:left w:type="dxa" w:w="100"/>
+              <w:bottom w:type="dxa" w:w="60"/>
+              <w:right w:type="dxa" w:w="100"/>
+            </w:tcMar>
+          </w:tcPr>
+          <w:p>
+            <w:pPr>
+              <w:spacing w:after="40"/>
+            </w:pPr>
+            <w:r>
+              <w:rPr>
+                <w:sz w:val="20"/>
+                <w:szCs w:val="20"/>
+              </w:rPr>
+              <w:t>Generar los secretos directamente en archivos fuera del repositorio, sin pegarlos en chats ni consolas, y revisar el Security Advisor de Supabase al cierre de cada sprint. Marcar una historia como terminada solo cuando su prueba cumpla todos los criterios de aceptación.</w:t>
+            </w:r>
+          </w:p>
+        </w:tc>
+      </w:tr>
+      <w:tr>
+        <w:tc>
+          <w:tcPr>
+            <w:tcW w:type="dxa" w:w="2500"/>
+            <w:tcBorders>
+              <w:top w:val="single" w:color="8EAADB" w:sz="4"/>
+              <w:left w:val="single" w:color="8EAADB" w:sz="4"/>
+              <w:bottom w:val="single" w:color="8EAADB" w:sz="4"/>
+              <w:right w:val="single" w:color="8EAADB" w:sz="4"/>
+            </w:tcBorders>
+            <w:shd w:fill="F2F2F2" w:color="auto" w:val="clear"/>
+            <w:tcMar>
+              <w:top w:type="dxa" w:w="60"/>
+              <w:left w:type="dxa" w:w="100"/>
+              <w:bottom w:type="dxa" w:w="60"/>
+              <w:right w:type="dxa" w:w="100"/>
+            </w:tcMar>
+          </w:tcPr>
+          <w:p>
+            <w:pPr>
+              <w:spacing w:after="40"/>
+            </w:pPr>
+            <w:r>
+              <w:rPr>
+                <w:b/>
+                <w:bCs/>
+                <w:sz w:val="20"/>
+                <w:szCs w:val="20"/>
+              </w:rPr>
+              <w:t xml:space="preserve">Acción concreta, responsable y fecha</w:t>
+            </w:r>
+          </w:p>
+        </w:tc>
+        <w:tc>
+          <w:tcPr>
+            <w:tcW w:type="dxa" w:w="6860"/>
+            <w:tcBorders>
+              <w:top w:val="single" w:color="8EAADB" w:sz="4"/>
+              <w:left w:val="single" w:color="8EAADB" w:sz="4"/>
+              <w:bottom w:val="single" w:color="8EAADB" w:sz="4"/>
+              <w:right w:val="single" w:color="8EAADB" w:sz="4"/>
+            </w:tcBorders>
+            <w:tcMar>
+              <w:top w:type="dxa" w:w="60"/>
+              <w:left w:type="dxa" w:w="100"/>
+              <w:bottom w:type="dxa" w:w="60"/>
+              <w:right w:type="dxa" w:w="100"/>
+            </w:tcMar>
+          </w:tcPr>
+          <w:p>
+            <w:pPr>
+              <w:spacing w:after="40"/>
+            </w:pPr>
+            <w:r>
+              <w:rPr>
+                <w:sz w:val="20"/>
+                <w:szCs w:val="20"/>
+              </w:rPr>
+              <w:t>Al cierre de cada sprint, ejecutar el Security Advisor de Supabase y contrastar el estado de cada historia con el registro de pruebas · Andrés Vergara · desde el cierre del Sprint 3 (11 de octubre de 2026).</w:t>
             </w:r>
           </w:p>
         </w:tc>

</xml_diff>

<commit_message>
docs(agil): cierre del Sprint 3, ficha y bitacora semanal del Sprint 4, backlog al 20/10
HU-03, HU-17 y HU-18 terminadas; HU-12 en progreso (SUS 4/5). Nuevas HU-20 a HU-23 desde hallazgos SUS. Correccion solicitada en la retroalimentacion de la Evaluacion 2.

Co-Authored-By: Claude Opus 5.5 <noreply@anthropic.com>

Claude-Session: https://claude.ai/code/session_01HM9mpD45KG7KmxBSVWVKiY
</commit_message>
<xml_diff>
--- a/docs/fase2/evidencias_proyecto/documentacion/agil/Fichas_Sprint_1-3_DomoVida.docx
+++ b/docs/fase2/evidencias_proyecto/documentacion/agil/Fichas_Sprint_1-3_DomoVida.docx
@@ -28,7 +28,7 @@
           <w:sz w:val="26"/>
           <w:szCs w:val="26"/>
         </w:rPr>
-        <w:t>Fichas de sprint y retrospectivas — Sprints 1, 2 y 3 (actualizado al 6 de octubre de 2026)</w:t>
+        <w:t>Fichas de sprint y retrospectivas — Sprints 1 a 4 (actualizado al 20 de octubre de 2026)</w:t>
       </w:r>
     </w:p>
     <w:p>
@@ -81,6 +81,14 @@
     </w:p>
     <w:p>
       <w:pPr>
+        <w:spacing w:after="120"/>
+      </w:pPr>
+      <w:r>
+        <w:t>Actualización del 20 de octubre de 2026: a partir de la retroalimentación de la Evaluación 2, el avance se registra cada semana en la bitácora del sprint en curso (Tabla H), en lugar de reconstruirlo desde los commits al final del sprint.</w:t>
+      </w:r>
+    </w:p>
+    <w:p>
+      <w:pPr>
         <w:pStyle w:val="Heading2"/>
       </w:pPr>
       <w:r>
@@ -247,7 +255,7 @@
                 <w:sz w:val="20"/>
                 <w:szCs w:val="20"/>
               </w:rPr>
-              <w:t>Estado al 06/10/2026</w:t>
+              <w:t>Estado al 20/10/2026</w:t>
             </w:r>
           </w:p>
         </w:tc>
@@ -601,7 +609,7 @@
                 <w:sz w:val="20"/>
                 <w:szCs w:val="20"/>
               </w:rPr>
-              <w:t>En curso (cierra el 11/10; corte al 06/10)</w:t>
+              <w:t>Cerrado (11/10)</w:t>
             </w:r>
           </w:p>
         </w:tc>
@@ -719,7 +727,7 @@
                 <w:sz w:val="20"/>
                 <w:szCs w:val="20"/>
               </w:rPr>
-              <w:t xml:space="preserve">Planificado</w:t>
+              <w:t>En curso (corte al 20/10)</w:t>
             </w:r>
           </w:p>
         </w:tc>
@@ -6954,6 +6962,2885 @@
                 <w:szCs w:val="20"/>
               </w:rPr>
               <w:t>Al cierre de cada sprint, ejecutar el Security Advisor de Supabase y contrastar el estado de cada historia con el registro de pruebas · Andrés Vergara · desde el cierre del Sprint 3 (11 de octubre de 2026).</w:t>
+            </w:r>
+          </w:p>
+        </w:tc>
+      </w:tr>
+    </w:tbl>
+    <w:p>
+      <w:pPr>
+        <w:pStyle w:val="Heading1"/>
+        <w:pageBreakBefore/>
+      </w:pPr>
+      <w:r>
+        <w:t>Sprint 3 (S7–S9) — cierre (7 al 11 de octubre)</w:t>
+      </w:r>
+    </w:p>
+    <w:p>
+      <w:pPr>
+        <w:pStyle w:val="Heading2"/>
+      </w:pPr>
+      <w:r>
+        <w:t>Ficha de sprint (7 al 11 de octubre de 2026)</w:t>
+      </w:r>
+    </w:p>
+    <w:p>
+      <w:pPr>
+        <w:spacing w:after="80" w:before="120"/>
+      </w:pPr>
+      <w:r>
+        <w:rPr>
+          <w:i/>
+          <w:iCs/>
+          <w:sz w:val="20"/>
+          <w:szCs w:val="20"/>
+        </w:rPr>
+        <w:t>Tabla F. Ficha del Sprint 3, cierre del 7 al 11 de octubre</w:t>
+      </w:r>
+    </w:p>
+    <w:tbl>
+      <w:tblPr>
+        <w:tblW w:type="dxa" w:w="9360"/>
+        <w:tblBorders>
+          <w:top w:val="single" w:color="auto" w:sz="4"/>
+          <w:left w:val="single" w:color="auto" w:sz="4"/>
+          <w:bottom w:val="single" w:color="auto" w:sz="4"/>
+          <w:right w:val="single" w:color="auto" w:sz="4"/>
+          <w:insideH w:val="single" w:color="auto" w:sz="4"/>
+          <w:insideV w:val="single" w:color="auto" w:sz="4"/>
+        </w:tblBorders>
+      </w:tblPr>
+      <w:tblGrid>
+        <w:gridCol w:w="2500"/>
+        <w:gridCol w:w="6860"/>
+      </w:tblGrid>
+      <w:tr>
+        <w:trPr>
+          <w:tblHeader/>
+        </w:trPr>
+        <w:tc>
+          <w:tcPr>
+            <w:tcW w:type="dxa" w:w="2500"/>
+            <w:tcBorders>
+              <w:top w:val="single" w:color="8EAADB" w:sz="4"/>
+              <w:left w:val="single" w:color="8EAADB" w:sz="4"/>
+              <w:bottom w:val="single" w:color="8EAADB" w:sz="4"/>
+              <w:right w:val="single" w:color="8EAADB" w:sz="4"/>
+            </w:tcBorders>
+            <w:shd w:fill="2F5496" w:color="auto" w:val="clear"/>
+            <w:tcMar>
+              <w:top w:type="dxa" w:w="60"/>
+              <w:left w:type="dxa" w:w="100"/>
+              <w:bottom w:type="dxa" w:w="60"/>
+              <w:right w:type="dxa" w:w="100"/>
+            </w:tcMar>
+          </w:tcPr>
+          <w:p>
+            <w:r>
+              <w:rPr>
+                <w:b/>
+                <w:bCs/>
+                <w:color w:val="FFFFFF"/>
+                <w:sz w:val="20"/>
+                <w:szCs w:val="20"/>
+              </w:rPr>
+              <w:t>Campo</w:t>
+            </w:r>
+          </w:p>
+        </w:tc>
+        <w:tc>
+          <w:tcPr>
+            <w:tcW w:type="dxa" w:w="6860"/>
+            <w:tcBorders>
+              <w:top w:val="single" w:color="8EAADB" w:sz="4"/>
+              <w:left w:val="single" w:color="8EAADB" w:sz="4"/>
+              <w:bottom w:val="single" w:color="8EAADB" w:sz="4"/>
+              <w:right w:val="single" w:color="8EAADB" w:sz="4"/>
+            </w:tcBorders>
+            <w:shd w:fill="2F5496" w:color="auto" w:val="clear"/>
+            <w:tcMar>
+              <w:top w:type="dxa" w:w="60"/>
+              <w:left w:type="dxa" w:w="100"/>
+              <w:bottom w:type="dxa" w:w="60"/>
+              <w:right w:type="dxa" w:w="100"/>
+            </w:tcMar>
+          </w:tcPr>
+          <w:p>
+            <w:r>
+              <w:rPr>
+                <w:b/>
+                <w:bCs/>
+                <w:color w:val="FFFFFF"/>
+                <w:sz w:val="20"/>
+                <w:szCs w:val="20"/>
+              </w:rPr>
+              <w:t>Contenido</w:t>
+            </w:r>
+          </w:p>
+        </w:tc>
+      </w:tr>
+      <w:tr>
+        <w:tc>
+          <w:tcPr>
+            <w:tcW w:type="dxa" w:w="2500"/>
+            <w:tcBorders>
+              <w:top w:val="single" w:color="8EAADB" w:sz="4"/>
+              <w:left w:val="single" w:color="8EAADB" w:sz="4"/>
+              <w:bottom w:val="single" w:color="8EAADB" w:sz="4"/>
+              <w:right w:val="single" w:color="8EAADB" w:sz="4"/>
+            </w:tcBorders>
+            <w:shd w:fill="F2F2F2" w:color="auto" w:val="clear"/>
+            <w:tcMar>
+              <w:top w:type="dxa" w:w="60"/>
+              <w:left w:type="dxa" w:w="100"/>
+              <w:bottom w:type="dxa" w:w="60"/>
+              <w:right w:type="dxa" w:w="100"/>
+            </w:tcMar>
+          </w:tcPr>
+          <w:p>
+            <w:pPr>
+              <w:spacing w:after="40"/>
+            </w:pPr>
+            <w:r>
+              <w:rPr>
+                <w:b/>
+                <w:bCs/>
+                <w:sz w:val="20"/>
+                <w:szCs w:val="20"/>
+              </w:rPr>
+              <w:t>Sprint o ciclo</w:t>
+            </w:r>
+          </w:p>
+        </w:tc>
+        <w:tc>
+          <w:tcPr>
+            <w:tcW w:type="dxa" w:w="6860"/>
+            <w:tcBorders>
+              <w:top w:val="single" w:color="8EAADB" w:sz="4"/>
+              <w:left w:val="single" w:color="8EAADB" w:sz="4"/>
+              <w:bottom w:val="single" w:color="8EAADB" w:sz="4"/>
+              <w:right w:val="single" w:color="8EAADB" w:sz="4"/>
+            </w:tcBorders>
+            <w:tcMar>
+              <w:top w:type="dxa" w:w="60"/>
+              <w:left w:type="dxa" w:w="100"/>
+              <w:bottom w:type="dxa" w:w="60"/>
+              <w:right w:type="dxa" w:w="100"/>
+            </w:tcMar>
+          </w:tcPr>
+          <w:p>
+            <w:pPr>
+              <w:spacing w:after="40"/>
+            </w:pPr>
+            <w:r>
+              <w:rPr>
+                <w:sz w:val="20"/>
+                <w:szCs w:val="20"/>
+              </w:rPr>
+              <w:t>Sprint 3 · cierre del 7 al 11 de octubre de 2026</w:t>
+            </w:r>
+          </w:p>
+        </w:tc>
+      </w:tr>
+      <w:tr>
+        <w:tc>
+          <w:tcPr>
+            <w:tcW w:type="dxa" w:w="2500"/>
+            <w:tcBorders>
+              <w:top w:val="single" w:color="8EAADB" w:sz="4"/>
+              <w:left w:val="single" w:color="8EAADB" w:sz="4"/>
+              <w:bottom w:val="single" w:color="8EAADB" w:sz="4"/>
+              <w:right w:val="single" w:color="8EAADB" w:sz="4"/>
+            </w:tcBorders>
+            <w:shd w:fill="F2F2F2" w:color="auto" w:val="clear"/>
+            <w:tcMar>
+              <w:top w:type="dxa" w:w="60"/>
+              <w:left w:type="dxa" w:w="100"/>
+              <w:bottom w:type="dxa" w:w="60"/>
+              <w:right w:type="dxa" w:w="100"/>
+            </w:tcMar>
+          </w:tcPr>
+          <w:p>
+            <w:pPr>
+              <w:spacing w:after="40"/>
+            </w:pPr>
+            <w:r>
+              <w:rPr>
+                <w:b/>
+                <w:bCs/>
+                <w:sz w:val="20"/>
+                <w:szCs w:val="20"/>
+              </w:rPr>
+              <w:t>Objetivo</w:t>
+            </w:r>
+          </w:p>
+        </w:tc>
+        <w:tc>
+          <w:tcPr>
+            <w:tcW w:type="dxa" w:w="6860"/>
+            <w:tcBorders>
+              <w:top w:val="single" w:color="8EAADB" w:sz="4"/>
+              <w:left w:val="single" w:color="8EAADB" w:sz="4"/>
+              <w:bottom w:val="single" w:color="8EAADB" w:sz="4"/>
+              <w:right w:val="single" w:color="8EAADB" w:sz="4"/>
+            </w:tcBorders>
+            <w:tcMar>
+              <w:top w:type="dxa" w:w="60"/>
+              <w:left w:type="dxa" w:w="100"/>
+              <w:bottom w:type="dxa" w:w="60"/>
+              <w:right w:type="dxa" w:w="100"/>
+            </w:tcMar>
+          </w:tcPr>
+          <w:p>
+            <w:pPr>
+              <w:spacing w:after="40"/>
+            </w:pPr>
+            <w:r>
+              <w:rPr>
+                <w:sz w:val="20"/>
+                <w:szCs w:val="20"/>
+              </w:rPr>
+              <w:t>Cerrar el pendiente de HU-03 (sincronización del modo borde), preparar la evaluación de usabilidad (HU-12) y acercar el servidor a los usuarios en Chile (HU-18).</w:t>
+            </w:r>
+          </w:p>
+        </w:tc>
+      </w:tr>
+      <w:tr>
+        <w:tc>
+          <w:tcPr>
+            <w:tcW w:type="dxa" w:w="2500"/>
+            <w:tcBorders>
+              <w:top w:val="single" w:color="8EAADB" w:sz="4"/>
+              <w:left w:val="single" w:color="8EAADB" w:sz="4"/>
+              <w:bottom w:val="single" w:color="8EAADB" w:sz="4"/>
+              <w:right w:val="single" w:color="8EAADB" w:sz="4"/>
+            </w:tcBorders>
+            <w:shd w:fill="F2F2F2" w:color="auto" w:val="clear"/>
+            <w:tcMar>
+              <w:top w:type="dxa" w:w="60"/>
+              <w:left w:type="dxa" w:w="100"/>
+              <w:bottom w:type="dxa" w:w="60"/>
+              <w:right w:type="dxa" w:w="100"/>
+            </w:tcMar>
+          </w:tcPr>
+          <w:p>
+            <w:pPr>
+              <w:spacing w:after="40"/>
+            </w:pPr>
+            <w:r>
+              <w:rPr>
+                <w:b/>
+                <w:bCs/>
+                <w:sz w:val="20"/>
+                <w:szCs w:val="20"/>
+              </w:rPr>
+              <w:t>Historias comprometidas</w:t>
+            </w:r>
+          </w:p>
+        </w:tc>
+        <w:tc>
+          <w:tcPr>
+            <w:tcW w:type="dxa" w:w="6860"/>
+            <w:tcBorders>
+              <w:top w:val="single" w:color="8EAADB" w:sz="4"/>
+              <w:left w:val="single" w:color="8EAADB" w:sz="4"/>
+              <w:bottom w:val="single" w:color="8EAADB" w:sz="4"/>
+              <w:right w:val="single" w:color="8EAADB" w:sz="4"/>
+            </w:tcBorders>
+            <w:tcMar>
+              <w:top w:type="dxa" w:w="60"/>
+              <w:left w:type="dxa" w:w="100"/>
+              <w:bottom w:type="dxa" w:w="60"/>
+              <w:right w:type="dxa" w:w="100"/>
+            </w:tcMar>
+          </w:tcPr>
+          <w:p>
+            <w:pPr>
+              <w:spacing w:after="40"/>
+            </w:pPr>
+            <w:r>
+              <w:rPr>
+                <w:sz w:val="20"/>
+                <w:szCs w:val="20"/>
+              </w:rPr>
+              <w:t>HU-03, HU-12 (preparación) y HU-18.</w:t>
+            </w:r>
+          </w:p>
+        </w:tc>
+      </w:tr>
+      <w:tr>
+        <w:tc>
+          <w:tcPr>
+            <w:tcW w:type="dxa" w:w="2500"/>
+            <w:tcBorders>
+              <w:top w:val="single" w:color="8EAADB" w:sz="4"/>
+              <w:left w:val="single" w:color="8EAADB" w:sz="4"/>
+              <w:bottom w:val="single" w:color="8EAADB" w:sz="4"/>
+              <w:right w:val="single" w:color="8EAADB" w:sz="4"/>
+            </w:tcBorders>
+            <w:shd w:fill="F2F2F2" w:color="auto" w:val="clear"/>
+            <w:tcMar>
+              <w:top w:type="dxa" w:w="60"/>
+              <w:left w:type="dxa" w:w="100"/>
+              <w:bottom w:type="dxa" w:w="60"/>
+              <w:right w:type="dxa" w:w="100"/>
+            </w:tcMar>
+          </w:tcPr>
+          <w:p>
+            <w:pPr>
+              <w:spacing w:after="40"/>
+            </w:pPr>
+            <w:r>
+              <w:rPr>
+                <w:b/>
+                <w:bCs/>
+                <w:sz w:val="20"/>
+                <w:szCs w:val="20"/>
+              </w:rPr>
+              <w:t>Historias terminadas</w:t>
+            </w:r>
+          </w:p>
+        </w:tc>
+        <w:tc>
+          <w:tcPr>
+            <w:tcW w:type="dxa" w:w="6860"/>
+            <w:tcBorders>
+              <w:top w:val="single" w:color="8EAADB" w:sz="4"/>
+              <w:left w:val="single" w:color="8EAADB" w:sz="4"/>
+              <w:bottom w:val="single" w:color="8EAADB" w:sz="4"/>
+              <w:right w:val="single" w:color="8EAADB" w:sz="4"/>
+            </w:tcBorders>
+            <w:tcMar>
+              <w:top w:type="dxa" w:w="60"/>
+              <w:left w:type="dxa" w:w="100"/>
+              <w:bottom w:type="dxa" w:w="60"/>
+              <w:right w:type="dxa" w:w="100"/>
+            </w:tcMar>
+          </w:tcPr>
+          <w:p>
+            <w:pPr>
+              <w:spacing w:after="40"/>
+            </w:pPr>
+            <w:r>
+              <w:rPr>
+                <w:sz w:val="20"/>
+                <w:szCs w:val="20"/>
+              </w:rPr>
+              <w:t>HU-03 terminada (08/10). HU-18 terminada (11/10) en la forma gratuita E2.1.Micro, porque Ampere A1 no tenía capacidad. HU-12 preparada: protocolo, cuestionario, formulario, cuenta de prueba y ensayo.</w:t>
+            </w:r>
+          </w:p>
+        </w:tc>
+      </w:tr>
+      <w:tr>
+        <w:tc>
+          <w:tcPr>
+            <w:tcW w:type="dxa" w:w="2500"/>
+            <w:tcBorders>
+              <w:top w:val="single" w:color="8EAADB" w:sz="4"/>
+              <w:left w:val="single" w:color="8EAADB" w:sz="4"/>
+              <w:bottom w:val="single" w:color="8EAADB" w:sz="4"/>
+              <w:right w:val="single" w:color="8EAADB" w:sz="4"/>
+            </w:tcBorders>
+            <w:shd w:fill="F2F2F2" w:color="auto" w:val="clear"/>
+            <w:tcMar>
+              <w:top w:type="dxa" w:w="60"/>
+              <w:left w:type="dxa" w:w="100"/>
+              <w:bottom w:type="dxa" w:w="60"/>
+              <w:right w:type="dxa" w:w="100"/>
+            </w:tcMar>
+          </w:tcPr>
+          <w:p>
+            <w:pPr>
+              <w:spacing w:after="40"/>
+            </w:pPr>
+            <w:r>
+              <w:rPr>
+                <w:b/>
+                <w:bCs/>
+                <w:sz w:val="20"/>
+                <w:szCs w:val="20"/>
+              </w:rPr>
+              <w:t>Funcionalidades implementadas</w:t>
+            </w:r>
+          </w:p>
+        </w:tc>
+        <w:tc>
+          <w:tcPr>
+            <w:tcW w:type="dxa" w:w="6860"/>
+            <w:tcBorders>
+              <w:top w:val="single" w:color="8EAADB" w:sz="4"/>
+              <w:left w:val="single" w:color="8EAADB" w:sz="4"/>
+              <w:bottom w:val="single" w:color="8EAADB" w:sz="4"/>
+              <w:right w:val="single" w:color="8EAADB" w:sz="4"/>
+            </w:tcBorders>
+            <w:tcMar>
+              <w:top w:type="dxa" w:w="60"/>
+              <w:left w:type="dxa" w:w="100"/>
+              <w:bottom w:type="dxa" w:w="60"/>
+              <w:right w:type="dxa" w:w="100"/>
+            </w:tcMar>
+          </w:tcPr>
+          <w:p>
+            <w:pPr>
+              <w:pStyle w:val="ListParagraph"/>
+              <w:numPr>
+                <w:ilvl w:val="0"/>
+                <w:numId w:val="2"/>
+              </w:numPr>
+              <w:spacing w:after="40"/>
+            </w:pPr>
+            <w:r>
+              <w:rPr>
+                <w:sz w:val="20"/>
+                <w:szCs w:val="20"/>
+              </w:rPr>
+              <w:t>Sincronización del modo borde con la nube (almacenamiento y reenvío con UUID, migración 003) y hora real del evento en los avisos tardíos.</w:t>
+            </w:r>
+          </w:p>
+          <w:p>
+            <w:pPr>
+              <w:pStyle w:val="ListParagraph"/>
+              <w:numPr>
+                <w:ilvl w:val="0"/>
+                <w:numId w:val="2"/>
+              </w:numPr>
+              <w:spacing w:after="40"/>
+            </w:pPr>
+            <w:r>
+              <w:rPr>
+                <w:sz w:val="20"/>
+                <w:szCs w:val="20"/>
+              </w:rPr>
+              <w:t>Rediseño del panel del cuidador: estado del hogar, lenguaje simple, modo oscuro y avisos repetidos agrupados.</w:t>
+            </w:r>
+          </w:p>
+          <w:p>
+            <w:pPr>
+              <w:pStyle w:val="ListParagraph"/>
+              <w:numPr>
+                <w:ilvl w:val="0"/>
+                <w:numId w:val="2"/>
+              </w:numPr>
+              <w:spacing w:after="40"/>
+            </w:pPr>
+            <w:r>
+              <w:rPr>
+                <w:sz w:val="20"/>
+                <w:szCs w:val="20"/>
+              </w:rPr>
+              <w:t>Historial con filtros en el servidor que abre en «Solo alertas», y actividad de hoy contada en el servidor (ajustes 20 y 21).</w:t>
+            </w:r>
+          </w:p>
+          <w:p>
+            <w:pPr>
+              <w:pStyle w:val="ListParagraph"/>
+              <w:numPr>
+                <w:ilvl w:val="0"/>
+                <w:numId w:val="2"/>
+              </w:numPr>
+              <w:spacing w:after="40"/>
+            </w:pPr>
+            <w:r>
+              <w:rPr>
+                <w:sz w:val="20"/>
+                <w:szCs w:val="20"/>
+              </w:rPr>
+              <w:t>Despliegue en Oracle Cloud Santiago con HTTPS (DuckDNS + Caddy + Let's Encrypt).</w:t>
+            </w:r>
+          </w:p>
+        </w:tc>
+      </w:tr>
+      <w:tr>
+        <w:tc>
+          <w:tcPr>
+            <w:tcW w:type="dxa" w:w="2500"/>
+            <w:tcBorders>
+              <w:top w:val="single" w:color="8EAADB" w:sz="4"/>
+              <w:left w:val="single" w:color="8EAADB" w:sz="4"/>
+              <w:bottom w:val="single" w:color="8EAADB" w:sz="4"/>
+              <w:right w:val="single" w:color="8EAADB" w:sz="4"/>
+            </w:tcBorders>
+            <w:shd w:fill="F2F2F2" w:color="auto" w:val="clear"/>
+            <w:tcMar>
+              <w:top w:type="dxa" w:w="60"/>
+              <w:left w:type="dxa" w:w="100"/>
+              <w:bottom w:type="dxa" w:w="60"/>
+              <w:right w:type="dxa" w:w="100"/>
+            </w:tcMar>
+          </w:tcPr>
+          <w:p>
+            <w:pPr>
+              <w:spacing w:after="40"/>
+            </w:pPr>
+            <w:r>
+              <w:rPr>
+                <w:b/>
+                <w:bCs/>
+                <w:sz w:val="20"/>
+                <w:szCs w:val="20"/>
+              </w:rPr>
+              <w:t>Pruebas realizadas</w:t>
+            </w:r>
+          </w:p>
+        </w:tc>
+        <w:tc>
+          <w:tcPr>
+            <w:tcW w:type="dxa" w:w="6860"/>
+            <w:tcBorders>
+              <w:top w:val="single" w:color="8EAADB" w:sz="4"/>
+              <w:left w:val="single" w:color="8EAADB" w:sz="4"/>
+              <w:bottom w:val="single" w:color="8EAADB" w:sz="4"/>
+              <w:right w:val="single" w:color="8EAADB" w:sz="4"/>
+            </w:tcBorders>
+            <w:tcMar>
+              <w:top w:type="dxa" w:w="60"/>
+              <w:left w:type="dxa" w:w="100"/>
+              <w:bottom w:type="dxa" w:w="60"/>
+              <w:right w:type="dxa" w:w="100"/>
+            </w:tcMar>
+          </w:tcPr>
+          <w:p>
+            <w:pPr>
+              <w:pStyle w:val="ListParagraph"/>
+              <w:numPr>
+                <w:ilvl w:val="0"/>
+                <w:numId w:val="2"/>
+              </w:numPr>
+              <w:spacing w:after="40"/>
+            </w:pPr>
+            <w:r>
+              <w:rPr>
+                <w:sz w:val="20"/>
+                <w:szCs w:val="20"/>
+              </w:rPr>
+              <w:t>PU-07 (13/13) y PR-03b (5/5 sincronizadas, 08/10).</w:t>
+            </w:r>
+          </w:p>
+          <w:p>
+            <w:pPr>
+              <w:pStyle w:val="ListParagraph"/>
+              <w:numPr>
+                <w:ilvl w:val="0"/>
+                <w:numId w:val="2"/>
+              </w:numPr>
+              <w:spacing w:after="40"/>
+            </w:pPr>
+            <w:r>
+              <w:rPr>
+                <w:sz w:val="20"/>
+                <w:szCs w:val="20"/>
+              </w:rPr>
+              <w:t>PU-08 (8/8) y PU-09 (9/9, 11/10).</w:t>
+            </w:r>
+          </w:p>
+          <w:p>
+            <w:pPr>
+              <w:pStyle w:val="ListParagraph"/>
+              <w:numPr>
+                <w:ilvl w:val="0"/>
+                <w:numId w:val="2"/>
+              </w:numPr>
+              <w:spacing w:after="40"/>
+            </w:pPr>
+            <w:r>
+              <w:rPr>
+                <w:sz w:val="20"/>
+                <w:szCs w:val="20"/>
+              </w:rPr>
+              <w:t>PR-01c: 30/30 alertas bajo 1 s, promedio 54 ms en Oracle Santiago (11/10).</w:t>
+            </w:r>
+          </w:p>
+          <w:p>
+            <w:pPr>
+              <w:pStyle w:val="ListParagraph"/>
+              <w:numPr>
+                <w:ilvl w:val="0"/>
+                <w:numId w:val="2"/>
+              </w:numPr>
+              <w:spacing w:after="40"/>
+            </w:pPr>
+            <w:r>
+              <w:rPr>
+                <w:sz w:val="20"/>
+                <w:szCs w:val="20"/>
+              </w:rPr>
+              <w:t>Ensayo completo del protocolo SUS (11/10).</w:t>
+            </w:r>
+          </w:p>
+        </w:tc>
+      </w:tr>
+      <w:tr>
+        <w:tc>
+          <w:tcPr>
+            <w:tcW w:type="dxa" w:w="2500"/>
+            <w:tcBorders>
+              <w:top w:val="single" w:color="8EAADB" w:sz="4"/>
+              <w:left w:val="single" w:color="8EAADB" w:sz="4"/>
+              <w:bottom w:val="single" w:color="8EAADB" w:sz="4"/>
+              <w:right w:val="single" w:color="8EAADB" w:sz="4"/>
+            </w:tcBorders>
+            <w:shd w:fill="F2F2F2" w:color="auto" w:val="clear"/>
+            <w:tcMar>
+              <w:top w:type="dxa" w:w="60"/>
+              <w:left w:type="dxa" w:w="100"/>
+              <w:bottom w:type="dxa" w:w="60"/>
+              <w:right w:type="dxa" w:w="100"/>
+            </w:tcMar>
+          </w:tcPr>
+          <w:p>
+            <w:pPr>
+              <w:spacing w:after="40"/>
+            </w:pPr>
+            <w:r>
+              <w:rPr>
+                <w:b/>
+                <w:bCs/>
+                <w:sz w:val="20"/>
+                <w:szCs w:val="20"/>
+              </w:rPr>
+              <w:t>Evidencias</w:t>
+            </w:r>
+          </w:p>
+        </w:tc>
+        <w:tc>
+          <w:tcPr>
+            <w:tcW w:type="dxa" w:w="6860"/>
+            <w:tcBorders>
+              <w:top w:val="single" w:color="8EAADB" w:sz="4"/>
+              <w:left w:val="single" w:color="8EAADB" w:sz="4"/>
+              <w:bottom w:val="single" w:color="8EAADB" w:sz="4"/>
+              <w:right w:val="single" w:color="8EAADB" w:sz="4"/>
+            </w:tcBorders>
+            <w:tcMar>
+              <w:top w:type="dxa" w:w="60"/>
+              <w:left w:type="dxa" w:w="100"/>
+              <w:bottom w:type="dxa" w:w="60"/>
+              <w:right w:type="dxa" w:w="100"/>
+            </w:tcMar>
+          </w:tcPr>
+          <w:p>
+            <w:pPr>
+              <w:pStyle w:val="ListParagraph"/>
+              <w:numPr>
+                <w:ilvl w:val="0"/>
+                <w:numId w:val="2"/>
+              </w:numPr>
+              <w:spacing w:after="40"/>
+            </w:pPr>
+            <w:r>
+              <w:rPr>
+                <w:sz w:val="20"/>
+                <w:szCs w:val="20"/>
+              </w:rPr>
+              <w:t>Commits 0a3f3df y 1178ebf (08/10): modo borde y PR-03b.</w:t>
+            </w:r>
+          </w:p>
+          <w:p>
+            <w:pPr>
+              <w:pStyle w:val="ListParagraph"/>
+              <w:numPr>
+                <w:ilvl w:val="0"/>
+                <w:numId w:val="2"/>
+              </w:numPr>
+              <w:spacing w:after="40"/>
+            </w:pPr>
+            <w:r>
+              <w:rPr>
+                <w:sz w:val="20"/>
+                <w:szCs w:val="20"/>
+              </w:rPr>
+              <w:t>Commits 8ed4171 a be549cd (08/10): rediseño del panel; 33e00b0 (08/10): protocolo SUS.</w:t>
+            </w:r>
+          </w:p>
+          <w:p>
+            <w:pPr>
+              <w:pStyle w:val="ListParagraph"/>
+              <w:numPr>
+                <w:ilvl w:val="0"/>
+                <w:numId w:val="2"/>
+              </w:numPr>
+              <w:spacing w:after="40"/>
+            </w:pPr>
+            <w:r>
+              <w:rPr>
+                <w:sz w:val="20"/>
+                <w:szCs w:val="20"/>
+              </w:rPr>
+              <w:t>Commits bc8f627, 09f0aa9, 2b16cff y ff25e8e (11/10): formulario SUS y ajustes 20 y 21.</w:t>
+            </w:r>
+          </w:p>
+          <w:p>
+            <w:pPr>
+              <w:pStyle w:val="ListParagraph"/>
+              <w:numPr>
+                <w:ilvl w:val="0"/>
+                <w:numId w:val="2"/>
+              </w:numPr>
+              <w:spacing w:after="40"/>
+            </w:pPr>
+            <w:r>
+              <w:rPr>
+                <w:sz w:val="20"/>
+                <w:szCs w:val="20"/>
+              </w:rPr>
+              <w:t>Commits d2e26f2 y 74bd290 (11/10): PR-01c y HTTPS en Oracle.</w:t>
+            </w:r>
+          </w:p>
+        </w:tc>
+      </w:tr>
+      <w:tr>
+        <w:tc>
+          <w:tcPr>
+            <w:tcW w:type="dxa" w:w="2500"/>
+            <w:tcBorders>
+              <w:top w:val="single" w:color="8EAADB" w:sz="4"/>
+              <w:left w:val="single" w:color="8EAADB" w:sz="4"/>
+              <w:bottom w:val="single" w:color="8EAADB" w:sz="4"/>
+              <w:right w:val="single" w:color="8EAADB" w:sz="4"/>
+            </w:tcBorders>
+            <w:shd w:fill="F2F2F2" w:color="auto" w:val="clear"/>
+            <w:tcMar>
+              <w:top w:type="dxa" w:w="60"/>
+              <w:left w:type="dxa" w:w="100"/>
+              <w:bottom w:type="dxa" w:w="60"/>
+              <w:right w:type="dxa" w:w="100"/>
+            </w:tcMar>
+          </w:tcPr>
+          <w:p>
+            <w:pPr>
+              <w:spacing w:after="40"/>
+            </w:pPr>
+            <w:r>
+              <w:rPr>
+                <w:b/>
+                <w:bCs/>
+                <w:sz w:val="20"/>
+                <w:szCs w:val="20"/>
+              </w:rPr>
+              <w:t>Problemas encontrados</w:t>
+            </w:r>
+          </w:p>
+        </w:tc>
+        <w:tc>
+          <w:tcPr>
+            <w:tcW w:type="dxa" w:w="6860"/>
+            <w:tcBorders>
+              <w:top w:val="single" w:color="8EAADB" w:sz="4"/>
+              <w:left w:val="single" w:color="8EAADB" w:sz="4"/>
+              <w:bottom w:val="single" w:color="8EAADB" w:sz="4"/>
+              <w:right w:val="single" w:color="8EAADB" w:sz="4"/>
+            </w:tcBorders>
+            <w:tcMar>
+              <w:top w:type="dxa" w:w="60"/>
+              <w:left w:type="dxa" w:w="100"/>
+              <w:bottom w:type="dxa" w:w="60"/>
+              <w:right w:type="dxa" w:w="100"/>
+            </w:tcMar>
+          </w:tcPr>
+          <w:p>
+            <w:pPr>
+              <w:pStyle w:val="ListParagraph"/>
+              <w:numPr>
+                <w:ilvl w:val="0"/>
+                <w:numId w:val="2"/>
+              </w:numPr>
+              <w:spacing w:after="40"/>
+            </w:pPr>
+            <w:r>
+              <w:rPr>
+                <w:sz w:val="20"/>
+                <w:szCs w:val="20"/>
+              </w:rPr>
+              <w:t>En la primera corrida de PR-03b el modo avión no cortó la conexión.</w:t>
+            </w:r>
+          </w:p>
+          <w:p>
+            <w:pPr>
+              <w:pStyle w:val="ListParagraph"/>
+              <w:numPr>
+                <w:ilvl w:val="0"/>
+                <w:numId w:val="2"/>
+              </w:numPr>
+              <w:spacing w:after="40"/>
+            </w:pPr>
+            <w:r>
+              <w:rPr>
+                <w:sz w:val="20"/>
+                <w:szCs w:val="20"/>
+              </w:rPr>
+              <w:t>El ensayo SUS mostró que la tarea T4 era imposible: el historial filtraba solo las últimas 50 lecturas.</w:t>
+            </w:r>
+          </w:p>
+          <w:p>
+            <w:pPr>
+              <w:pStyle w:val="ListParagraph"/>
+              <w:numPr>
+                <w:ilvl w:val="0"/>
+                <w:numId w:val="2"/>
+              </w:numPr>
+              <w:spacing w:after="40"/>
+            </w:pPr>
+            <w:r>
+              <w:rPr>
+                <w:sz w:val="20"/>
+                <w:szCs w:val="20"/>
+              </w:rPr>
+              <w:t>Ampere A1 sin capacidad en Santiago; el servidor de Oracle solo respondía por http.</w:t>
+            </w:r>
+          </w:p>
+        </w:tc>
+      </w:tr>
+      <w:tr>
+        <w:tc>
+          <w:tcPr>
+            <w:tcW w:type="dxa" w:w="2500"/>
+            <w:tcBorders>
+              <w:top w:val="single" w:color="8EAADB" w:sz="4"/>
+              <w:left w:val="single" w:color="8EAADB" w:sz="4"/>
+              <w:bottom w:val="single" w:color="8EAADB" w:sz="4"/>
+              <w:right w:val="single" w:color="8EAADB" w:sz="4"/>
+            </w:tcBorders>
+            <w:shd w:fill="F2F2F2" w:color="auto" w:val="clear"/>
+            <w:tcMar>
+              <w:top w:type="dxa" w:w="60"/>
+              <w:left w:type="dxa" w:w="100"/>
+              <w:bottom w:type="dxa" w:w="60"/>
+              <w:right w:type="dxa" w:w="100"/>
+            </w:tcMar>
+          </w:tcPr>
+          <w:p>
+            <w:pPr>
+              <w:spacing w:after="40"/>
+            </w:pPr>
+            <w:r>
+              <w:rPr>
+                <w:b/>
+                <w:bCs/>
+                <w:sz w:val="20"/>
+                <w:szCs w:val="20"/>
+              </w:rPr>
+              <w:t>Acciones tomadas</w:t>
+            </w:r>
+          </w:p>
+        </w:tc>
+        <w:tc>
+          <w:tcPr>
+            <w:tcW w:type="dxa" w:w="6860"/>
+            <w:tcBorders>
+              <w:top w:val="single" w:color="8EAADB" w:sz="4"/>
+              <w:left w:val="single" w:color="8EAADB" w:sz="4"/>
+              <w:bottom w:val="single" w:color="8EAADB" w:sz="4"/>
+              <w:right w:val="single" w:color="8EAADB" w:sz="4"/>
+            </w:tcBorders>
+            <w:tcMar>
+              <w:top w:type="dxa" w:w="60"/>
+              <w:left w:type="dxa" w:w="100"/>
+              <w:bottom w:type="dxa" w:w="60"/>
+              <w:right w:type="dxa" w:w="100"/>
+            </w:tcMar>
+          </w:tcPr>
+          <w:p>
+            <w:pPr>
+              <w:pStyle w:val="ListParagraph"/>
+              <w:numPr>
+                <w:ilvl w:val="0"/>
+                <w:numId w:val="2"/>
+              </w:numPr>
+              <w:spacing w:after="40"/>
+            </w:pPr>
+            <w:r>
+              <w:rPr>
+                <w:sz w:val="20"/>
+                <w:szCs w:val="20"/>
+              </w:rPr>
+              <w:t>El script de PR-03b comprueba el corte real de internet antes de enviar.</w:t>
+            </w:r>
+          </w:p>
+          <w:p>
+            <w:pPr>
+              <w:pStyle w:val="ListParagraph"/>
+              <w:numPr>
+                <w:ilvl w:val="0"/>
+                <w:numId w:val="2"/>
+              </w:numPr>
+              <w:spacing w:after="40"/>
+            </w:pPr>
+            <w:r>
+              <w:rPr>
+                <w:sz w:val="20"/>
+                <w:szCs w:val="20"/>
+              </w:rPr>
+              <w:t>Filtros y conteos trasladados al servidor (ajustes 20 y 21).</w:t>
+            </w:r>
+          </w:p>
+          <w:p>
+            <w:pPr>
+              <w:pStyle w:val="ListParagraph"/>
+              <w:numPr>
+                <w:ilvl w:val="0"/>
+                <w:numId w:val="2"/>
+              </w:numPr>
+              <w:spacing w:after="40"/>
+            </w:pPr>
+            <w:r>
+              <w:rPr>
+                <w:sz w:val="20"/>
+                <w:szCs w:val="20"/>
+              </w:rPr>
+              <w:t>Forma E2.1.Micro en lugar de Ampere, con reintento automático (12/10), y HTTPS con Caddy (ajuste 23).</w:t>
+            </w:r>
+          </w:p>
+        </w:tc>
+      </w:tr>
+      <w:tr>
+        <w:tc>
+          <w:tcPr>
+            <w:tcW w:type="dxa" w:w="2500"/>
+            <w:tcBorders>
+              <w:top w:val="single" w:color="8EAADB" w:sz="4"/>
+              <w:left w:val="single" w:color="8EAADB" w:sz="4"/>
+              <w:bottom w:val="single" w:color="8EAADB" w:sz="4"/>
+              <w:right w:val="single" w:color="8EAADB" w:sz="4"/>
+            </w:tcBorders>
+            <w:shd w:fill="F2F2F2" w:color="auto" w:val="clear"/>
+            <w:tcMar>
+              <w:top w:type="dxa" w:w="60"/>
+              <w:left w:type="dxa" w:w="100"/>
+              <w:bottom w:type="dxa" w:w="60"/>
+              <w:right w:type="dxa" w:w="100"/>
+            </w:tcMar>
+          </w:tcPr>
+          <w:p>
+            <w:pPr>
+              <w:spacing w:after="40"/>
+            </w:pPr>
+            <w:r>
+              <w:rPr>
+                <w:b/>
+                <w:bCs/>
+                <w:sz w:val="20"/>
+                <w:szCs w:val="20"/>
+              </w:rPr>
+              <w:t>Pendientes</w:t>
+            </w:r>
+          </w:p>
+        </w:tc>
+        <w:tc>
+          <w:tcPr>
+            <w:tcW w:type="dxa" w:w="6860"/>
+            <w:tcBorders>
+              <w:top w:val="single" w:color="8EAADB" w:sz="4"/>
+              <w:left w:val="single" w:color="8EAADB" w:sz="4"/>
+              <w:bottom w:val="single" w:color="8EAADB" w:sz="4"/>
+              <w:right w:val="single" w:color="8EAADB" w:sz="4"/>
+            </w:tcBorders>
+            <w:tcMar>
+              <w:top w:type="dxa" w:w="60"/>
+              <w:left w:type="dxa" w:w="100"/>
+              <w:bottom w:type="dxa" w:w="60"/>
+              <w:right w:type="dxa" w:w="100"/>
+            </w:tcMar>
+          </w:tcPr>
+          <w:p>
+            <w:pPr>
+              <w:pStyle w:val="ListParagraph"/>
+              <w:numPr>
+                <w:ilvl w:val="0"/>
+                <w:numId w:val="2"/>
+              </w:numPr>
+              <w:spacing w:after="40"/>
+            </w:pPr>
+            <w:r>
+              <w:rPr>
+                <w:sz w:val="20"/>
+                <w:szCs w:val="20"/>
+              </w:rPr>
+              <w:t>Sesiones SUS con cuidadores reales (HU-12) y prueba de carga PR-04 → Sprint 4.</w:t>
+            </w:r>
+          </w:p>
+          <w:p>
+            <w:pPr>
+              <w:pStyle w:val="ListParagraph"/>
+              <w:numPr>
+                <w:ilvl w:val="0"/>
+                <w:numId w:val="2"/>
+              </w:numPr>
+              <w:spacing w:after="40"/>
+            </w:pPr>
+            <w:r>
+              <w:rPr>
+                <w:sz w:val="20"/>
+                <w:szCs w:val="20"/>
+              </w:rPr>
+              <w:t>Apuntar el panel de Vercel al servidor de Oracle (CORS y WebSocket seguro).</w:t>
+            </w:r>
+          </w:p>
+        </w:tc>
+      </w:tr>
+    </w:tbl>
+    <w:p>
+      <w:pPr>
+        <w:pStyle w:val="Heading2"/>
+      </w:pPr>
+      <w:r>
+        <w:t>Retrospectiva del Sprint 3 (cierre, 11 de octubre)</w:t>
+      </w:r>
+    </w:p>
+    <w:tbl>
+      <w:tblPr>
+        <w:tblW w:type="dxa" w:w="9360"/>
+        <w:tblBorders>
+          <w:top w:val="single" w:color="auto" w:sz="4"/>
+          <w:left w:val="single" w:color="auto" w:sz="4"/>
+          <w:bottom w:val="single" w:color="auto" w:sz="4"/>
+          <w:right w:val="single" w:color="auto" w:sz="4"/>
+          <w:insideH w:val="single" w:color="auto" w:sz="4"/>
+          <w:insideV w:val="single" w:color="auto" w:sz="4"/>
+        </w:tblBorders>
+      </w:tblPr>
+      <w:tblGrid>
+        <w:gridCol w:w="2500"/>
+        <w:gridCol w:w="6860"/>
+      </w:tblGrid>
+      <w:tr>
+        <w:trPr>
+          <w:tblHeader/>
+        </w:trPr>
+        <w:tc>
+          <w:tcPr>
+            <w:tcW w:type="dxa" w:w="2500"/>
+            <w:tcBorders>
+              <w:top w:val="single" w:color="8EAADB" w:sz="4"/>
+              <w:left w:val="single" w:color="8EAADB" w:sz="4"/>
+              <w:bottom w:val="single" w:color="8EAADB" w:sz="4"/>
+              <w:right w:val="single" w:color="8EAADB" w:sz="4"/>
+            </w:tcBorders>
+            <w:shd w:fill="2F5496" w:color="auto" w:val="clear"/>
+            <w:tcMar>
+              <w:top w:type="dxa" w:w="60"/>
+              <w:left w:type="dxa" w:w="100"/>
+              <w:bottom w:type="dxa" w:w="60"/>
+              <w:right w:type="dxa" w:w="100"/>
+            </w:tcMar>
+          </w:tcPr>
+          <w:p>
+            <w:r>
+              <w:rPr>
+                <w:b/>
+                <w:bCs/>
+                <w:color w:val="FFFFFF"/>
+                <w:sz w:val="20"/>
+                <w:szCs w:val="20"/>
+              </w:rPr>
+              <w:t>Campo</w:t>
+            </w:r>
+          </w:p>
+        </w:tc>
+        <w:tc>
+          <w:tcPr>
+            <w:tcW w:type="dxa" w:w="6860"/>
+            <w:tcBorders>
+              <w:top w:val="single" w:color="8EAADB" w:sz="4"/>
+              <w:left w:val="single" w:color="8EAADB" w:sz="4"/>
+              <w:bottom w:val="single" w:color="8EAADB" w:sz="4"/>
+              <w:right w:val="single" w:color="8EAADB" w:sz="4"/>
+            </w:tcBorders>
+            <w:shd w:fill="2F5496" w:color="auto" w:val="clear"/>
+            <w:tcMar>
+              <w:top w:type="dxa" w:w="60"/>
+              <w:left w:type="dxa" w:w="100"/>
+              <w:bottom w:type="dxa" w:w="60"/>
+              <w:right w:type="dxa" w:w="100"/>
+            </w:tcMar>
+          </w:tcPr>
+          <w:p>
+            <w:r>
+              <w:rPr>
+                <w:b/>
+                <w:bCs/>
+                <w:color w:val="FFFFFF"/>
+                <w:sz w:val="20"/>
+                <w:szCs w:val="20"/>
+              </w:rPr>
+              <w:t>Contenido</w:t>
+            </w:r>
+          </w:p>
+        </w:tc>
+      </w:tr>
+      <w:tr>
+        <w:tc>
+          <w:tcPr>
+            <w:tcW w:type="dxa" w:w="2500"/>
+            <w:tcBorders>
+              <w:top w:val="single" w:color="8EAADB" w:sz="4"/>
+              <w:left w:val="single" w:color="8EAADB" w:sz="4"/>
+              <w:bottom w:val="single" w:color="8EAADB" w:sz="4"/>
+              <w:right w:val="single" w:color="8EAADB" w:sz="4"/>
+            </w:tcBorders>
+            <w:shd w:fill="F2F2F2" w:color="auto" w:val="clear"/>
+            <w:tcMar>
+              <w:top w:type="dxa" w:w="60"/>
+              <w:left w:type="dxa" w:w="100"/>
+              <w:bottom w:type="dxa" w:w="60"/>
+              <w:right w:type="dxa" w:w="100"/>
+            </w:tcMar>
+          </w:tcPr>
+          <w:p>
+            <w:pPr>
+              <w:spacing w:after="40"/>
+            </w:pPr>
+            <w:r>
+              <w:rPr>
+                <w:b/>
+                <w:bCs/>
+                <w:sz w:val="20"/>
+                <w:szCs w:val="20"/>
+              </w:rPr>
+              <w:t>Verificación de la acción anterior</w:t>
+            </w:r>
+          </w:p>
+        </w:tc>
+        <w:tc>
+          <w:tcPr>
+            <w:tcW w:type="dxa" w:w="6860"/>
+            <w:tcBorders>
+              <w:top w:val="single" w:color="8EAADB" w:sz="4"/>
+              <w:left w:val="single" w:color="8EAADB" w:sz="4"/>
+              <w:bottom w:val="single" w:color="8EAADB" w:sz="4"/>
+              <w:right w:val="single" w:color="8EAADB" w:sz="4"/>
+            </w:tcBorders>
+            <w:tcMar>
+              <w:top w:type="dxa" w:w="60"/>
+              <w:left w:type="dxa" w:w="100"/>
+              <w:bottom w:type="dxa" w:w="60"/>
+              <w:right w:type="dxa" w:w="100"/>
+            </w:tcMar>
+          </w:tcPr>
+          <w:p>
+            <w:pPr>
+              <w:spacing w:after="40"/>
+            </w:pPr>
+            <w:r>
+              <w:rPr>
+                <w:sz w:val="20"/>
+                <w:szCs w:val="20"/>
+              </w:rPr>
+              <w:t>Acción del 06/10: contrastar el estado de cada historia con el registro de pruebas al cierre del sprint. Se cumplió con atraso: el contraste se hizo al actualizar el backlog el 20/10.</w:t>
+            </w:r>
+          </w:p>
+        </w:tc>
+      </w:tr>
+      <w:tr>
+        <w:tc>
+          <w:tcPr>
+            <w:tcW w:type="dxa" w:w="2500"/>
+            <w:tcBorders>
+              <w:top w:val="single" w:color="8EAADB" w:sz="4"/>
+              <w:left w:val="single" w:color="8EAADB" w:sz="4"/>
+              <w:bottom w:val="single" w:color="8EAADB" w:sz="4"/>
+              <w:right w:val="single" w:color="8EAADB" w:sz="4"/>
+            </w:tcBorders>
+            <w:shd w:fill="F2F2F2" w:color="auto" w:val="clear"/>
+            <w:tcMar>
+              <w:top w:type="dxa" w:w="60"/>
+              <w:left w:type="dxa" w:w="100"/>
+              <w:bottom w:type="dxa" w:w="60"/>
+              <w:right w:type="dxa" w:w="100"/>
+            </w:tcMar>
+          </w:tcPr>
+          <w:p>
+            <w:pPr>
+              <w:spacing w:after="40"/>
+            </w:pPr>
+            <w:r>
+              <w:rPr>
+                <w:b/>
+                <w:bCs/>
+                <w:sz w:val="20"/>
+                <w:szCs w:val="20"/>
+              </w:rPr>
+              <w:t>¿Qué funcionó bien?</w:t>
+            </w:r>
+          </w:p>
+        </w:tc>
+        <w:tc>
+          <w:tcPr>
+            <w:tcW w:type="dxa" w:w="6860"/>
+            <w:tcBorders>
+              <w:top w:val="single" w:color="8EAADB" w:sz="4"/>
+              <w:left w:val="single" w:color="8EAADB" w:sz="4"/>
+              <w:bottom w:val="single" w:color="8EAADB" w:sz="4"/>
+              <w:right w:val="single" w:color="8EAADB" w:sz="4"/>
+            </w:tcBorders>
+            <w:tcMar>
+              <w:top w:type="dxa" w:w="60"/>
+              <w:left w:type="dxa" w:w="100"/>
+              <w:bottom w:type="dxa" w:w="60"/>
+              <w:right w:type="dxa" w:w="100"/>
+            </w:tcMar>
+          </w:tcPr>
+          <w:p>
+            <w:pPr>
+              <w:spacing w:after="40"/>
+            </w:pPr>
+            <w:r>
+              <w:rPr>
+                <w:sz w:val="20"/>
+                <w:szCs w:val="20"/>
+              </w:rPr>
+              <w:t>Ensayar el protocolo SUS antes de citar a los participantes detectó una tarea imposible (T4) y dos errores del panel, que se corrigieron el mismo día.</w:t>
+            </w:r>
+          </w:p>
+        </w:tc>
+      </w:tr>
+      <w:tr>
+        <w:tc>
+          <w:tcPr>
+            <w:tcW w:type="dxa" w:w="2500"/>
+            <w:tcBorders>
+              <w:top w:val="single" w:color="8EAADB" w:sz="4"/>
+              <w:left w:val="single" w:color="8EAADB" w:sz="4"/>
+              <w:bottom w:val="single" w:color="8EAADB" w:sz="4"/>
+              <w:right w:val="single" w:color="8EAADB" w:sz="4"/>
+            </w:tcBorders>
+            <w:shd w:fill="F2F2F2" w:color="auto" w:val="clear"/>
+            <w:tcMar>
+              <w:top w:type="dxa" w:w="60"/>
+              <w:left w:type="dxa" w:w="100"/>
+              <w:bottom w:type="dxa" w:w="60"/>
+              <w:right w:type="dxa" w:w="100"/>
+            </w:tcMar>
+          </w:tcPr>
+          <w:p>
+            <w:pPr>
+              <w:spacing w:after="40"/>
+            </w:pPr>
+            <w:r>
+              <w:rPr>
+                <w:b/>
+                <w:bCs/>
+                <w:sz w:val="20"/>
+                <w:szCs w:val="20"/>
+              </w:rPr>
+              <w:t>¿Qué problemas tuvimos?</w:t>
+            </w:r>
+          </w:p>
+        </w:tc>
+        <w:tc>
+          <w:tcPr>
+            <w:tcW w:type="dxa" w:w="6860"/>
+            <w:tcBorders>
+              <w:top w:val="single" w:color="8EAADB" w:sz="4"/>
+              <w:left w:val="single" w:color="8EAADB" w:sz="4"/>
+              <w:bottom w:val="single" w:color="8EAADB" w:sz="4"/>
+              <w:right w:val="single" w:color="8EAADB" w:sz="4"/>
+            </w:tcBorders>
+            <w:tcMar>
+              <w:top w:type="dxa" w:w="60"/>
+              <w:left w:type="dxa" w:w="100"/>
+              <w:bottom w:type="dxa" w:w="60"/>
+              <w:right w:type="dxa" w:w="100"/>
+            </w:tcMar>
+          </w:tcPr>
+          <w:p>
+            <w:pPr>
+              <w:spacing w:after="40"/>
+            </w:pPr>
+            <w:r>
+              <w:rPr>
+                <w:sz w:val="20"/>
+                <w:szCs w:val="20"/>
+              </w:rPr>
+              <w:t>La documentación ágil quedó sin actualizar entre el 6 y el 20 de octubre, y hubo que completarla después (retroalimentación de la Evaluación 2).</w:t>
+            </w:r>
+          </w:p>
+        </w:tc>
+      </w:tr>
+      <w:tr>
+        <w:tc>
+          <w:tcPr>
+            <w:tcW w:type="dxa" w:w="2500"/>
+            <w:tcBorders>
+              <w:top w:val="single" w:color="8EAADB" w:sz="4"/>
+              <w:left w:val="single" w:color="8EAADB" w:sz="4"/>
+              <w:bottom w:val="single" w:color="8EAADB" w:sz="4"/>
+              <w:right w:val="single" w:color="8EAADB" w:sz="4"/>
+            </w:tcBorders>
+            <w:shd w:fill="F2F2F2" w:color="auto" w:val="clear"/>
+            <w:tcMar>
+              <w:top w:type="dxa" w:w="60"/>
+              <w:left w:type="dxa" w:w="100"/>
+              <w:bottom w:type="dxa" w:w="60"/>
+              <w:right w:type="dxa" w:w="100"/>
+            </w:tcMar>
+          </w:tcPr>
+          <w:p>
+            <w:pPr>
+              <w:spacing w:after="40"/>
+            </w:pPr>
+            <w:r>
+              <w:rPr>
+                <w:b/>
+                <w:bCs/>
+                <w:sz w:val="20"/>
+                <w:szCs w:val="20"/>
+              </w:rPr>
+              <w:t>¿Qué vamos a cambiar?</w:t>
+            </w:r>
+          </w:p>
+        </w:tc>
+        <w:tc>
+          <w:tcPr>
+            <w:tcW w:type="dxa" w:w="6860"/>
+            <w:tcBorders>
+              <w:top w:val="single" w:color="8EAADB" w:sz="4"/>
+              <w:left w:val="single" w:color="8EAADB" w:sz="4"/>
+              <w:bottom w:val="single" w:color="8EAADB" w:sz="4"/>
+              <w:right w:val="single" w:color="8EAADB" w:sz="4"/>
+            </w:tcBorders>
+            <w:tcMar>
+              <w:top w:type="dxa" w:w="60"/>
+              <w:left w:type="dxa" w:w="100"/>
+              <w:bottom w:type="dxa" w:w="60"/>
+              <w:right w:type="dxa" w:w="100"/>
+            </w:tcMar>
+          </w:tcPr>
+          <w:p>
+            <w:pPr>
+              <w:spacing w:after="40"/>
+            </w:pPr>
+            <w:r>
+              <w:rPr>
+                <w:sz w:val="20"/>
+                <w:szCs w:val="20"/>
+              </w:rPr>
+              <w:t>Registrar el avance cada semana en la ficha del sprint en curso, en vez de reconstruirlo al final.</w:t>
+            </w:r>
+          </w:p>
+        </w:tc>
+      </w:tr>
+      <w:tr>
+        <w:tc>
+          <w:tcPr>
+            <w:tcW w:type="dxa" w:w="2500"/>
+            <w:tcBorders>
+              <w:top w:val="single" w:color="8EAADB" w:sz="4"/>
+              <w:left w:val="single" w:color="8EAADB" w:sz="4"/>
+              <w:bottom w:val="single" w:color="8EAADB" w:sz="4"/>
+              <w:right w:val="single" w:color="8EAADB" w:sz="4"/>
+            </w:tcBorders>
+            <w:shd w:fill="F2F2F2" w:color="auto" w:val="clear"/>
+            <w:tcMar>
+              <w:top w:type="dxa" w:w="60"/>
+              <w:left w:type="dxa" w:w="100"/>
+              <w:bottom w:type="dxa" w:w="60"/>
+              <w:right w:type="dxa" w:w="100"/>
+            </w:tcMar>
+          </w:tcPr>
+          <w:p>
+            <w:pPr>
+              <w:spacing w:after="40"/>
+            </w:pPr>
+            <w:r>
+              <w:rPr>
+                <w:b/>
+                <w:bCs/>
+                <w:sz w:val="20"/>
+                <w:szCs w:val="20"/>
+              </w:rPr>
+              <w:t>Acción concreta, responsable y fecha</w:t>
+            </w:r>
+          </w:p>
+        </w:tc>
+        <w:tc>
+          <w:tcPr>
+            <w:tcW w:type="dxa" w:w="6860"/>
+            <w:tcBorders>
+              <w:top w:val="single" w:color="8EAADB" w:sz="4"/>
+              <w:left w:val="single" w:color="8EAADB" w:sz="4"/>
+              <w:bottom w:val="single" w:color="8EAADB" w:sz="4"/>
+              <w:right w:val="single" w:color="8EAADB" w:sz="4"/>
+            </w:tcBorders>
+            <w:tcMar>
+              <w:top w:type="dxa" w:w="60"/>
+              <w:left w:type="dxa" w:w="100"/>
+              <w:bottom w:type="dxa" w:w="60"/>
+              <w:right w:type="dxa" w:w="100"/>
+            </w:tcMar>
+          </w:tcPr>
+          <w:p>
+            <w:pPr>
+              <w:spacing w:after="40"/>
+            </w:pPr>
+            <w:r>
+              <w:rPr>
+                <w:sz w:val="20"/>
+                <w:szCs w:val="20"/>
+              </w:rPr>
+              <w:t>Actualizar cada domingo la bitácora semanal (Tabla H) y el Product Backlog · Andrés Vergara · desde el 25 de octubre de 2026.</w:t>
+            </w:r>
+          </w:p>
+        </w:tc>
+      </w:tr>
+    </w:tbl>
+    <w:p>
+      <w:pPr>
+        <w:pStyle w:val="Heading1"/>
+        <w:pageBreakBefore/>
+      </w:pPr>
+      <w:r>
+        <w:t>Sprint 4 (S10–S12) — en curso</w:t>
+      </w:r>
+    </w:p>
+    <w:p>
+      <w:pPr>
+        <w:pStyle w:val="Heading2"/>
+      </w:pPr>
+      <w:r>
+        <w:t>Ficha de sprint (corte al 20 de octubre de 2026)</w:t>
+      </w:r>
+    </w:p>
+    <w:p>
+      <w:pPr>
+        <w:spacing w:after="80" w:before="120"/>
+      </w:pPr>
+      <w:r>
+        <w:rPr>
+          <w:i/>
+          <w:iCs/>
+          <w:sz w:val="20"/>
+          <w:szCs w:val="20"/>
+        </w:rPr>
+        <w:t>Tabla G. Ficha del Sprint 4</w:t>
+      </w:r>
+    </w:p>
+    <w:tbl>
+      <w:tblPr>
+        <w:tblW w:type="dxa" w:w="9360"/>
+        <w:tblBorders>
+          <w:top w:val="single" w:color="auto" w:sz="4"/>
+          <w:left w:val="single" w:color="auto" w:sz="4"/>
+          <w:bottom w:val="single" w:color="auto" w:sz="4"/>
+          <w:right w:val="single" w:color="auto" w:sz="4"/>
+          <w:insideH w:val="single" w:color="auto" w:sz="4"/>
+          <w:insideV w:val="single" w:color="auto" w:sz="4"/>
+        </w:tblBorders>
+      </w:tblPr>
+      <w:tblGrid>
+        <w:gridCol w:w="2500"/>
+        <w:gridCol w:w="6860"/>
+      </w:tblGrid>
+      <w:tr>
+        <w:trPr>
+          <w:tblHeader/>
+        </w:trPr>
+        <w:tc>
+          <w:tcPr>
+            <w:tcW w:type="dxa" w:w="2500"/>
+            <w:tcBorders>
+              <w:top w:val="single" w:color="8EAADB" w:sz="4"/>
+              <w:left w:val="single" w:color="8EAADB" w:sz="4"/>
+              <w:bottom w:val="single" w:color="8EAADB" w:sz="4"/>
+              <w:right w:val="single" w:color="8EAADB" w:sz="4"/>
+            </w:tcBorders>
+            <w:shd w:fill="2F5496" w:color="auto" w:val="clear"/>
+            <w:tcMar>
+              <w:top w:type="dxa" w:w="60"/>
+              <w:left w:type="dxa" w:w="100"/>
+              <w:bottom w:type="dxa" w:w="60"/>
+              <w:right w:type="dxa" w:w="100"/>
+            </w:tcMar>
+          </w:tcPr>
+          <w:p>
+            <w:r>
+              <w:rPr>
+                <w:b/>
+                <w:bCs/>
+                <w:color w:val="FFFFFF"/>
+                <w:sz w:val="20"/>
+                <w:szCs w:val="20"/>
+              </w:rPr>
+              <w:t>Campo</w:t>
+            </w:r>
+          </w:p>
+        </w:tc>
+        <w:tc>
+          <w:tcPr>
+            <w:tcW w:type="dxa" w:w="6860"/>
+            <w:tcBorders>
+              <w:top w:val="single" w:color="8EAADB" w:sz="4"/>
+              <w:left w:val="single" w:color="8EAADB" w:sz="4"/>
+              <w:bottom w:val="single" w:color="8EAADB" w:sz="4"/>
+              <w:right w:val="single" w:color="8EAADB" w:sz="4"/>
+            </w:tcBorders>
+            <w:shd w:fill="2F5496" w:color="auto" w:val="clear"/>
+            <w:tcMar>
+              <w:top w:type="dxa" w:w="60"/>
+              <w:left w:type="dxa" w:w="100"/>
+              <w:bottom w:type="dxa" w:w="60"/>
+              <w:right w:type="dxa" w:w="100"/>
+            </w:tcMar>
+          </w:tcPr>
+          <w:p>
+            <w:r>
+              <w:rPr>
+                <w:b/>
+                <w:bCs/>
+                <w:color w:val="FFFFFF"/>
+                <w:sz w:val="20"/>
+                <w:szCs w:val="20"/>
+              </w:rPr>
+              <w:t>Contenido</w:t>
+            </w:r>
+          </w:p>
+        </w:tc>
+      </w:tr>
+      <w:tr>
+        <w:tc>
+          <w:tcPr>
+            <w:tcW w:type="dxa" w:w="2500"/>
+            <w:tcBorders>
+              <w:top w:val="single" w:color="8EAADB" w:sz="4"/>
+              <w:left w:val="single" w:color="8EAADB" w:sz="4"/>
+              <w:bottom w:val="single" w:color="8EAADB" w:sz="4"/>
+              <w:right w:val="single" w:color="8EAADB" w:sz="4"/>
+            </w:tcBorders>
+            <w:shd w:fill="F2F2F2" w:color="auto" w:val="clear"/>
+            <w:tcMar>
+              <w:top w:type="dxa" w:w="60"/>
+              <w:left w:type="dxa" w:w="100"/>
+              <w:bottom w:type="dxa" w:w="60"/>
+              <w:right w:type="dxa" w:w="100"/>
+            </w:tcMar>
+          </w:tcPr>
+          <w:p>
+            <w:pPr>
+              <w:spacing w:after="40"/>
+            </w:pPr>
+            <w:r>
+              <w:rPr>
+                <w:b/>
+                <w:bCs/>
+                <w:sz w:val="20"/>
+                <w:szCs w:val="20"/>
+              </w:rPr>
+              <w:t>Sprint o ciclo</w:t>
+            </w:r>
+          </w:p>
+        </w:tc>
+        <w:tc>
+          <w:tcPr>
+            <w:tcW w:type="dxa" w:w="6860"/>
+            <w:tcBorders>
+              <w:top w:val="single" w:color="8EAADB" w:sz="4"/>
+              <w:left w:val="single" w:color="8EAADB" w:sz="4"/>
+              <w:bottom w:val="single" w:color="8EAADB" w:sz="4"/>
+              <w:right w:val="single" w:color="8EAADB" w:sz="4"/>
+            </w:tcBorders>
+            <w:tcMar>
+              <w:top w:type="dxa" w:w="60"/>
+              <w:left w:type="dxa" w:w="100"/>
+              <w:bottom w:type="dxa" w:w="60"/>
+              <w:right w:type="dxa" w:w="100"/>
+            </w:tcMar>
+          </w:tcPr>
+          <w:p>
+            <w:pPr>
+              <w:spacing w:after="40"/>
+            </w:pPr>
+            <w:r>
+              <w:rPr>
+                <w:sz w:val="20"/>
+                <w:szCs w:val="20"/>
+              </w:rPr>
+              <w:t>Sprint 4 · 12 de octubre – 1 de noviembre de 2026 · ficha con corte al 20 de octubre</w:t>
+            </w:r>
+          </w:p>
+        </w:tc>
+      </w:tr>
+      <w:tr>
+        <w:tc>
+          <w:tcPr>
+            <w:tcW w:type="dxa" w:w="2500"/>
+            <w:tcBorders>
+              <w:top w:val="single" w:color="8EAADB" w:sz="4"/>
+              <w:left w:val="single" w:color="8EAADB" w:sz="4"/>
+              <w:bottom w:val="single" w:color="8EAADB" w:sz="4"/>
+              <w:right w:val="single" w:color="8EAADB" w:sz="4"/>
+            </w:tcBorders>
+            <w:shd w:fill="F2F2F2" w:color="auto" w:val="clear"/>
+            <w:tcMar>
+              <w:top w:type="dxa" w:w="60"/>
+              <w:left w:type="dxa" w:w="100"/>
+              <w:bottom w:type="dxa" w:w="60"/>
+              <w:right w:type="dxa" w:w="100"/>
+            </w:tcMar>
+          </w:tcPr>
+          <w:p>
+            <w:pPr>
+              <w:spacing w:after="40"/>
+            </w:pPr>
+            <w:r>
+              <w:rPr>
+                <w:b/>
+                <w:bCs/>
+                <w:sz w:val="20"/>
+                <w:szCs w:val="20"/>
+              </w:rPr>
+              <w:t>Objetivo</w:t>
+            </w:r>
+          </w:p>
+        </w:tc>
+        <w:tc>
+          <w:tcPr>
+            <w:tcW w:type="dxa" w:w="6860"/>
+            <w:tcBorders>
+              <w:top w:val="single" w:color="8EAADB" w:sz="4"/>
+              <w:left w:val="single" w:color="8EAADB" w:sz="4"/>
+              <w:bottom w:val="single" w:color="8EAADB" w:sz="4"/>
+              <w:right w:val="single" w:color="8EAADB" w:sz="4"/>
+            </w:tcBorders>
+            <w:tcMar>
+              <w:top w:type="dxa" w:w="60"/>
+              <w:left w:type="dxa" w:w="100"/>
+              <w:bottom w:type="dxa" w:w="60"/>
+              <w:right w:type="dxa" w:w="100"/>
+            </w:tcMar>
+          </w:tcPr>
+          <w:p>
+            <w:pPr>
+              <w:spacing w:after="40"/>
+            </w:pPr>
+            <w:r>
+              <w:rPr>
+                <w:sz w:val="20"/>
+                <w:szCs w:val="20"/>
+              </w:rPr>
+              <w:t>Validar la usabilidad del panel con cuidadores reales (OE3) y certificar el rendimiento del sistema en infraestructura ubicada en Chile (OE2).</w:t>
+            </w:r>
+          </w:p>
+        </w:tc>
+      </w:tr>
+      <w:tr>
+        <w:tc>
+          <w:tcPr>
+            <w:tcW w:type="dxa" w:w="2500"/>
+            <w:tcBorders>
+              <w:top w:val="single" w:color="8EAADB" w:sz="4"/>
+              <w:left w:val="single" w:color="8EAADB" w:sz="4"/>
+              <w:bottom w:val="single" w:color="8EAADB" w:sz="4"/>
+              <w:right w:val="single" w:color="8EAADB" w:sz="4"/>
+            </w:tcBorders>
+            <w:shd w:fill="F2F2F2" w:color="auto" w:val="clear"/>
+            <w:tcMar>
+              <w:top w:type="dxa" w:w="60"/>
+              <w:left w:type="dxa" w:w="100"/>
+              <w:bottom w:type="dxa" w:w="60"/>
+              <w:right w:type="dxa" w:w="100"/>
+            </w:tcMar>
+          </w:tcPr>
+          <w:p>
+            <w:pPr>
+              <w:spacing w:after="40"/>
+            </w:pPr>
+            <w:r>
+              <w:rPr>
+                <w:b/>
+                <w:bCs/>
+                <w:sz w:val="20"/>
+                <w:szCs w:val="20"/>
+              </w:rPr>
+              <w:t>Historias comprometidas</w:t>
+            </w:r>
+          </w:p>
+        </w:tc>
+        <w:tc>
+          <w:tcPr>
+            <w:tcW w:type="dxa" w:w="6860"/>
+            <w:tcBorders>
+              <w:top w:val="single" w:color="8EAADB" w:sz="4"/>
+              <w:left w:val="single" w:color="8EAADB" w:sz="4"/>
+              <w:bottom w:val="single" w:color="8EAADB" w:sz="4"/>
+              <w:right w:val="single" w:color="8EAADB" w:sz="4"/>
+            </w:tcBorders>
+            <w:tcMar>
+              <w:top w:type="dxa" w:w="60"/>
+              <w:left w:type="dxa" w:w="100"/>
+              <w:bottom w:type="dxa" w:w="60"/>
+              <w:right w:type="dxa" w:w="100"/>
+            </w:tcMar>
+          </w:tcPr>
+          <w:p>
+            <w:pPr>
+              <w:spacing w:after="40"/>
+            </w:pPr>
+            <w:r>
+              <w:rPr>
+                <w:sz w:val="20"/>
+                <w:szCs w:val="20"/>
+              </w:rPr>
+              <w:t>HU-12 (evaluación SUS), HU-19 (RLS por cuidador) y la prueba de carga PR-04. Agregadas el 20/10 desde los hallazgos SUS: HU-21 (semáforo y estado de los sensores) y HU-23 (contraste).</w:t>
+            </w:r>
+          </w:p>
+        </w:tc>
+      </w:tr>
+      <w:tr>
+        <w:tc>
+          <w:tcPr>
+            <w:tcW w:type="dxa" w:w="2500"/>
+            <w:tcBorders>
+              <w:top w:val="single" w:color="8EAADB" w:sz="4"/>
+              <w:left w:val="single" w:color="8EAADB" w:sz="4"/>
+              <w:bottom w:val="single" w:color="8EAADB" w:sz="4"/>
+              <w:right w:val="single" w:color="8EAADB" w:sz="4"/>
+            </w:tcBorders>
+            <w:shd w:fill="F2F2F2" w:color="auto" w:val="clear"/>
+            <w:tcMar>
+              <w:top w:type="dxa" w:w="60"/>
+              <w:left w:type="dxa" w:w="100"/>
+              <w:bottom w:type="dxa" w:w="60"/>
+              <w:right w:type="dxa" w:w="100"/>
+            </w:tcMar>
+          </w:tcPr>
+          <w:p>
+            <w:pPr>
+              <w:spacing w:after="40"/>
+            </w:pPr>
+            <w:r>
+              <w:rPr>
+                <w:b/>
+                <w:bCs/>
+                <w:sz w:val="20"/>
+                <w:szCs w:val="20"/>
+              </w:rPr>
+              <w:t>Historias terminadas</w:t>
+            </w:r>
+          </w:p>
+        </w:tc>
+        <w:tc>
+          <w:tcPr>
+            <w:tcW w:type="dxa" w:w="6860"/>
+            <w:tcBorders>
+              <w:top w:val="single" w:color="8EAADB" w:sz="4"/>
+              <w:left w:val="single" w:color="8EAADB" w:sz="4"/>
+              <w:bottom w:val="single" w:color="8EAADB" w:sz="4"/>
+              <w:right w:val="single" w:color="8EAADB" w:sz="4"/>
+            </w:tcBorders>
+            <w:tcMar>
+              <w:top w:type="dxa" w:w="60"/>
+              <w:left w:type="dxa" w:w="100"/>
+              <w:bottom w:type="dxa" w:w="60"/>
+              <w:right w:type="dxa" w:w="100"/>
+            </w:tcMar>
+          </w:tcPr>
+          <w:p>
+            <w:pPr>
+              <w:spacing w:after="40"/>
+            </w:pPr>
+            <w:r>
+              <w:rPr>
+                <w:sz w:val="20"/>
+                <w:szCs w:val="20"/>
+              </w:rPr>
+              <w:t>Al 20/10: ninguna historia nueva cerrada. HU-12 en progreso (4 de 5 sesiones). PR-04 ejecutada y aprobada.</w:t>
+            </w:r>
+          </w:p>
+        </w:tc>
+      </w:tr>
+      <w:tr>
+        <w:tc>
+          <w:tcPr>
+            <w:tcW w:type="dxa" w:w="2500"/>
+            <w:tcBorders>
+              <w:top w:val="single" w:color="8EAADB" w:sz="4"/>
+              <w:left w:val="single" w:color="8EAADB" w:sz="4"/>
+              <w:bottom w:val="single" w:color="8EAADB" w:sz="4"/>
+              <w:right w:val="single" w:color="8EAADB" w:sz="4"/>
+            </w:tcBorders>
+            <w:shd w:fill="F2F2F2" w:color="auto" w:val="clear"/>
+            <w:tcMar>
+              <w:top w:type="dxa" w:w="60"/>
+              <w:left w:type="dxa" w:w="100"/>
+              <w:bottom w:type="dxa" w:w="60"/>
+              <w:right w:type="dxa" w:w="100"/>
+            </w:tcMar>
+          </w:tcPr>
+          <w:p>
+            <w:pPr>
+              <w:spacing w:after="40"/>
+            </w:pPr>
+            <w:r>
+              <w:rPr>
+                <w:b/>
+                <w:bCs/>
+                <w:sz w:val="20"/>
+                <w:szCs w:val="20"/>
+              </w:rPr>
+              <w:t>Funcionalidades implementadas</w:t>
+            </w:r>
+          </w:p>
+        </w:tc>
+        <w:tc>
+          <w:tcPr>
+            <w:tcW w:type="dxa" w:w="6860"/>
+            <w:tcBorders>
+              <w:top w:val="single" w:color="8EAADB" w:sz="4"/>
+              <w:left w:val="single" w:color="8EAADB" w:sz="4"/>
+              <w:bottom w:val="single" w:color="8EAADB" w:sz="4"/>
+              <w:right w:val="single" w:color="8EAADB" w:sz="4"/>
+            </w:tcBorders>
+            <w:tcMar>
+              <w:top w:type="dxa" w:w="60"/>
+              <w:left w:type="dxa" w:w="100"/>
+              <w:bottom w:type="dxa" w:w="60"/>
+              <w:right w:type="dxa" w:w="100"/>
+            </w:tcMar>
+          </w:tcPr>
+          <w:p>
+            <w:pPr>
+              <w:pStyle w:val="ListParagraph"/>
+              <w:numPr>
+                <w:ilvl w:val="0"/>
+                <w:numId w:val="2"/>
+              </w:numPr>
+              <w:spacing w:after="40"/>
+            </w:pPr>
+            <w:r>
+              <w:rPr>
+                <w:sz w:val="20"/>
+                <w:szCs w:val="20"/>
+              </w:rPr>
+              <w:t>Hora del panel fija en hora de Chile (America/Santiago), independiente del dispositivo del cuidador (hallazgo H-P02-5).</w:t>
+            </w:r>
+          </w:p>
+          <w:p>
+            <w:pPr>
+              <w:pStyle w:val="ListParagraph"/>
+              <w:numPr>
+                <w:ilvl w:val="0"/>
+                <w:numId w:val="2"/>
+              </w:numPr>
+              <w:spacing w:after="40"/>
+            </w:pPr>
+            <w:r>
+              <w:rPr>
+                <w:sz w:val="20"/>
+                <w:szCs w:val="20"/>
+              </w:rPr>
+              <w:t>Reintento automático para obtener la máquina Ampere A1 en Oracle.</w:t>
+            </w:r>
+          </w:p>
+          <w:p>
+            <w:pPr>
+              <w:pStyle w:val="ListParagraph"/>
+              <w:numPr>
+                <w:ilvl w:val="0"/>
+                <w:numId w:val="2"/>
+              </w:numPr>
+              <w:spacing w:after="40"/>
+            </w:pPr>
+            <w:r>
+              <w:rPr>
+                <w:sz w:val="20"/>
+                <w:szCs w:val="20"/>
+              </w:rPr>
+              <w:t>Repositorio depurado: se eliminó la estructura duplicada backend/app.</w:t>
+            </w:r>
+          </w:p>
+        </w:tc>
+      </w:tr>
+      <w:tr>
+        <w:tc>
+          <w:tcPr>
+            <w:tcW w:type="dxa" w:w="2500"/>
+            <w:tcBorders>
+              <w:top w:val="single" w:color="8EAADB" w:sz="4"/>
+              <w:left w:val="single" w:color="8EAADB" w:sz="4"/>
+              <w:bottom w:val="single" w:color="8EAADB" w:sz="4"/>
+              <w:right w:val="single" w:color="8EAADB" w:sz="4"/>
+            </w:tcBorders>
+            <w:shd w:fill="F2F2F2" w:color="auto" w:val="clear"/>
+            <w:tcMar>
+              <w:top w:type="dxa" w:w="60"/>
+              <w:left w:type="dxa" w:w="100"/>
+              <w:bottom w:type="dxa" w:w="60"/>
+              <w:right w:type="dxa" w:w="100"/>
+            </w:tcMar>
+          </w:tcPr>
+          <w:p>
+            <w:pPr>
+              <w:spacing w:after="40"/>
+            </w:pPr>
+            <w:r>
+              <w:rPr>
+                <w:b/>
+                <w:bCs/>
+                <w:sz w:val="20"/>
+                <w:szCs w:val="20"/>
+              </w:rPr>
+              <w:t>Pruebas realizadas</w:t>
+            </w:r>
+          </w:p>
+        </w:tc>
+        <w:tc>
+          <w:tcPr>
+            <w:tcW w:type="dxa" w:w="6860"/>
+            <w:tcBorders>
+              <w:top w:val="single" w:color="8EAADB" w:sz="4"/>
+              <w:left w:val="single" w:color="8EAADB" w:sz="4"/>
+              <w:bottom w:val="single" w:color="8EAADB" w:sz="4"/>
+              <w:right w:val="single" w:color="8EAADB" w:sz="4"/>
+            </w:tcBorders>
+            <w:tcMar>
+              <w:top w:type="dxa" w:w="60"/>
+              <w:left w:type="dxa" w:w="100"/>
+              <w:bottom w:type="dxa" w:w="60"/>
+              <w:right w:type="dxa" w:w="100"/>
+            </w:tcMar>
+          </w:tcPr>
+          <w:p>
+            <w:pPr>
+              <w:pStyle w:val="ListParagraph"/>
+              <w:numPr>
+                <w:ilvl w:val="0"/>
+                <w:numId w:val="2"/>
+              </w:numPr>
+              <w:spacing w:after="40"/>
+            </w:pPr>
+            <w:r>
+              <w:rPr>
+                <w:sz w:val="20"/>
+                <w:szCs w:val="20"/>
+              </w:rPr>
+              <w:t>Evaluación SUS con 4 cuidadores reales bajo consentimiento informado (15 al 19/10): 80; 77,5; 100 y 100, promedio 89,4 (meta &gt; 70).</w:t>
+            </w:r>
+          </w:p>
+          <w:p>
+            <w:pPr>
+              <w:pStyle w:val="ListParagraph"/>
+              <w:numPr>
+                <w:ilvl w:val="0"/>
+                <w:numId w:val="2"/>
+              </w:numPr>
+              <w:spacing w:after="40"/>
+            </w:pPr>
+            <w:r>
+              <w:rPr>
+                <w:sz w:val="20"/>
+                <w:szCs w:val="20"/>
+              </w:rPr>
+              <w:t>PR-04: 20 usuarios concurrentes, 976 solicitudes, 0 errores, p95 de 57 ms (sensores) y 110 ms (historial).</w:t>
+            </w:r>
+          </w:p>
+        </w:tc>
+      </w:tr>
+      <w:tr>
+        <w:tc>
+          <w:tcPr>
+            <w:tcW w:type="dxa" w:w="2500"/>
+            <w:tcBorders>
+              <w:top w:val="single" w:color="8EAADB" w:sz="4"/>
+              <w:left w:val="single" w:color="8EAADB" w:sz="4"/>
+              <w:bottom w:val="single" w:color="8EAADB" w:sz="4"/>
+              <w:right w:val="single" w:color="8EAADB" w:sz="4"/>
+            </w:tcBorders>
+            <w:shd w:fill="F2F2F2" w:color="auto" w:val="clear"/>
+            <w:tcMar>
+              <w:top w:type="dxa" w:w="60"/>
+              <w:left w:type="dxa" w:w="100"/>
+              <w:bottom w:type="dxa" w:w="60"/>
+              <w:right w:type="dxa" w:w="100"/>
+            </w:tcMar>
+          </w:tcPr>
+          <w:p>
+            <w:pPr>
+              <w:spacing w:after="40"/>
+            </w:pPr>
+            <w:r>
+              <w:rPr>
+                <w:b/>
+                <w:bCs/>
+                <w:sz w:val="20"/>
+                <w:szCs w:val="20"/>
+              </w:rPr>
+              <w:t>Evidencias</w:t>
+            </w:r>
+          </w:p>
+        </w:tc>
+        <w:tc>
+          <w:tcPr>
+            <w:tcW w:type="dxa" w:w="6860"/>
+            <w:tcBorders>
+              <w:top w:val="single" w:color="8EAADB" w:sz="4"/>
+              <w:left w:val="single" w:color="8EAADB" w:sz="4"/>
+              <w:bottom w:val="single" w:color="8EAADB" w:sz="4"/>
+              <w:right w:val="single" w:color="8EAADB" w:sz="4"/>
+            </w:tcBorders>
+            <w:tcMar>
+              <w:top w:type="dxa" w:w="60"/>
+              <w:left w:type="dxa" w:w="100"/>
+              <w:bottom w:type="dxa" w:w="60"/>
+              <w:right w:type="dxa" w:w="100"/>
+            </w:tcMar>
+          </w:tcPr>
+          <w:p>
+            <w:pPr>
+              <w:pStyle w:val="ListParagraph"/>
+              <w:numPr>
+                <w:ilvl w:val="0"/>
+                <w:numId w:val="2"/>
+              </w:numPr>
+              <w:spacing w:after="40"/>
+            </w:pPr>
+            <w:r>
+              <w:rPr>
+                <w:sz w:val="20"/>
+                <w:szCs w:val="20"/>
+              </w:rPr>
+              <w:t>Commits 6c56335 y dbfdb4e (12/10), 5f95c1c (17/10), 42ba705 (19/10), 1a82453 y 455a5b0 (20/10).</w:t>
+            </w:r>
+          </w:p>
+          <w:p>
+            <w:pPr>
+              <w:pStyle w:val="ListParagraph"/>
+              <w:numPr>
+                <w:ilvl w:val="0"/>
+                <w:numId w:val="2"/>
+              </w:numPr>
+              <w:spacing w:after="40"/>
+            </w:pPr>
+            <w:r>
+              <w:rPr>
+                <w:sz w:val="20"/>
+                <w:szCs w:val="20"/>
+              </w:rPr>
+              <w:t>Notas de sesión en usabilidad/sesiones (P01 a P04) y reporte de Locust en pruebas (PR-04).</w:t>
+            </w:r>
+          </w:p>
+        </w:tc>
+      </w:tr>
+      <w:tr>
+        <w:tc>
+          <w:tcPr>
+            <w:tcW w:type="dxa" w:w="2500"/>
+            <w:tcBorders>
+              <w:top w:val="single" w:color="8EAADB" w:sz="4"/>
+              <w:left w:val="single" w:color="8EAADB" w:sz="4"/>
+              <w:bottom w:val="single" w:color="8EAADB" w:sz="4"/>
+              <w:right w:val="single" w:color="8EAADB" w:sz="4"/>
+            </w:tcBorders>
+            <w:shd w:fill="F2F2F2" w:color="auto" w:val="clear"/>
+            <w:tcMar>
+              <w:top w:type="dxa" w:w="60"/>
+              <w:left w:type="dxa" w:w="100"/>
+              <w:bottom w:type="dxa" w:w="60"/>
+              <w:right w:type="dxa" w:w="100"/>
+            </w:tcMar>
+          </w:tcPr>
+          <w:p>
+            <w:pPr>
+              <w:spacing w:after="40"/>
+            </w:pPr>
+            <w:r>
+              <w:rPr>
+                <w:b/>
+                <w:bCs/>
+                <w:sz w:val="20"/>
+                <w:szCs w:val="20"/>
+              </w:rPr>
+              <w:t>Problemas encontrados</w:t>
+            </w:r>
+          </w:p>
+        </w:tc>
+        <w:tc>
+          <w:tcPr>
+            <w:tcW w:type="dxa" w:w="6860"/>
+            <w:tcBorders>
+              <w:top w:val="single" w:color="8EAADB" w:sz="4"/>
+              <w:left w:val="single" w:color="8EAADB" w:sz="4"/>
+              <w:bottom w:val="single" w:color="8EAADB" w:sz="4"/>
+              <w:right w:val="single" w:color="8EAADB" w:sz="4"/>
+            </w:tcBorders>
+            <w:tcMar>
+              <w:top w:type="dxa" w:w="60"/>
+              <w:left w:type="dxa" w:w="100"/>
+              <w:bottom w:type="dxa" w:w="60"/>
+              <w:right w:type="dxa" w:w="100"/>
+            </w:tcMar>
+          </w:tcPr>
+          <w:p>
+            <w:pPr>
+              <w:pStyle w:val="ListParagraph"/>
+              <w:numPr>
+                <w:ilvl w:val="0"/>
+                <w:numId w:val="2"/>
+              </w:numPr>
+              <w:spacing w:after="40"/>
+            </w:pPr>
+            <w:r>
+              <w:rPr>
+                <w:sz w:val="20"/>
+                <w:szCs w:val="20"/>
+              </w:rPr>
+              <w:t>P01 no pudo ingresar desde el celular por la contraseña compleja.</w:t>
+            </w:r>
+          </w:p>
+          <w:p>
+            <w:pPr>
+              <w:pStyle w:val="ListParagraph"/>
+              <w:numPr>
+                <w:ilvl w:val="0"/>
+                <w:numId w:val="2"/>
+              </w:numPr>
+              <w:spacing w:after="40"/>
+            </w:pPr>
+            <w:r>
+              <w:rPr>
+                <w:sz w:val="20"/>
+                <w:szCs w:val="20"/>
+              </w:rPr>
+              <w:t>P03 respondió el SUS con 5 en todos los ítems, también en los negativos.</w:t>
+            </w:r>
+          </w:p>
+          <w:p>
+            <w:pPr>
+              <w:pStyle w:val="ListParagraph"/>
+              <w:numPr>
+                <w:ilvl w:val="0"/>
+                <w:numId w:val="2"/>
+              </w:numPr>
+              <w:spacing w:after="40"/>
+            </w:pPr>
+            <w:r>
+              <w:rPr>
+                <w:sz w:val="20"/>
+                <w:szCs w:val="20"/>
+              </w:rPr>
+              <w:t>El teléfono de P02 mostraba una hora distinta a la del panel.</w:t>
+            </w:r>
+          </w:p>
+          <w:p>
+            <w:pPr>
+              <w:pStyle w:val="ListParagraph"/>
+              <w:numPr>
+                <w:ilvl w:val="0"/>
+                <w:numId w:val="2"/>
+              </w:numPr>
+              <w:spacing w:after="40"/>
+            </w:pPr>
+            <w:r>
+              <w:rPr>
+                <w:sz w:val="20"/>
+                <w:szCs w:val="20"/>
+              </w:rPr>
+              <w:t>Oracle no respondió la solicitud de cuenta de pago (sin acceso a Ampere).</w:t>
+            </w:r>
+          </w:p>
+        </w:tc>
+      </w:tr>
+      <w:tr>
+        <w:tc>
+          <w:tcPr>
+            <w:tcW w:type="dxa" w:w="2500"/>
+            <w:tcBorders>
+              <w:top w:val="single" w:color="8EAADB" w:sz="4"/>
+              <w:left w:val="single" w:color="8EAADB" w:sz="4"/>
+              <w:bottom w:val="single" w:color="8EAADB" w:sz="4"/>
+              <w:right w:val="single" w:color="8EAADB" w:sz="4"/>
+            </w:tcBorders>
+            <w:shd w:fill="F2F2F2" w:color="auto" w:val="clear"/>
+            <w:tcMar>
+              <w:top w:type="dxa" w:w="60"/>
+              <w:left w:type="dxa" w:w="100"/>
+              <w:bottom w:type="dxa" w:w="60"/>
+              <w:right w:type="dxa" w:w="100"/>
+            </w:tcMar>
+          </w:tcPr>
+          <w:p>
+            <w:pPr>
+              <w:spacing w:after="40"/>
+            </w:pPr>
+            <w:r>
+              <w:rPr>
+                <w:b/>
+                <w:bCs/>
+                <w:sz w:val="20"/>
+                <w:szCs w:val="20"/>
+              </w:rPr>
+              <w:t>Acciones tomadas</w:t>
+            </w:r>
+          </w:p>
+        </w:tc>
+        <w:tc>
+          <w:tcPr>
+            <w:tcW w:type="dxa" w:w="6860"/>
+            <w:tcBorders>
+              <w:top w:val="single" w:color="8EAADB" w:sz="4"/>
+              <w:left w:val="single" w:color="8EAADB" w:sz="4"/>
+              <w:bottom w:val="single" w:color="8EAADB" w:sz="4"/>
+              <w:right w:val="single" w:color="8EAADB" w:sz="4"/>
+            </w:tcBorders>
+            <w:tcMar>
+              <w:top w:type="dxa" w:w="60"/>
+              <w:left w:type="dxa" w:w="100"/>
+              <w:bottom w:type="dxa" w:w="60"/>
+              <w:right w:type="dxa" w:w="100"/>
+            </w:tcMar>
+          </w:tcPr>
+          <w:p>
+            <w:pPr>
+              <w:pStyle w:val="ListParagraph"/>
+              <w:numPr>
+                <w:ilvl w:val="0"/>
+                <w:numId w:val="2"/>
+              </w:numPr>
+              <w:spacing w:after="40"/>
+            </w:pPr>
+            <w:r>
+              <w:rPr>
+                <w:sz w:val="20"/>
+                <w:szCs w:val="20"/>
+              </w:rPr>
+              <w:t>Contraseña simple para la cuenta de prueba durante las sesiones (se cambia al cerrarlas).</w:t>
+            </w:r>
+          </w:p>
+          <w:p>
+            <w:pPr>
+              <w:pStyle w:val="ListParagraph"/>
+              <w:numPr>
+                <w:ilvl w:val="0"/>
+                <w:numId w:val="2"/>
+              </w:numPr>
+              <w:spacing w:after="40"/>
+            </w:pPr>
+            <w:r>
+              <w:rPr>
+                <w:sz w:val="20"/>
+                <w:szCs w:val="20"/>
+              </w:rPr>
+              <w:t>Advertencia sobre ítems positivos y negativos antes de la encuesta; segunda aplicación a P03 documentada con análisis de sensibilidad.</w:t>
+            </w:r>
+          </w:p>
+          <w:p>
+            <w:pPr>
+              <w:pStyle w:val="ListParagraph"/>
+              <w:numPr>
+                <w:ilvl w:val="0"/>
+                <w:numId w:val="2"/>
+              </w:numPr>
+              <w:spacing w:after="40"/>
+            </w:pPr>
+            <w:r>
+              <w:rPr>
+                <w:sz w:val="20"/>
+                <w:szCs w:val="20"/>
+              </w:rPr>
+              <w:t>Zona horaria fija en el panel (commit 5f95c1c), verificada en la sesión P03.</w:t>
+            </w:r>
+          </w:p>
+        </w:tc>
+      </w:tr>
+      <w:tr>
+        <w:tc>
+          <w:tcPr>
+            <w:tcW w:type="dxa" w:w="2500"/>
+            <w:tcBorders>
+              <w:top w:val="single" w:color="8EAADB" w:sz="4"/>
+              <w:left w:val="single" w:color="8EAADB" w:sz="4"/>
+              <w:bottom w:val="single" w:color="8EAADB" w:sz="4"/>
+              <w:right w:val="single" w:color="8EAADB" w:sz="4"/>
+            </w:tcBorders>
+            <w:shd w:fill="F2F2F2" w:color="auto" w:val="clear"/>
+            <w:tcMar>
+              <w:top w:type="dxa" w:w="60"/>
+              <w:left w:type="dxa" w:w="100"/>
+              <w:bottom w:type="dxa" w:w="60"/>
+              <w:right w:type="dxa" w:w="100"/>
+            </w:tcMar>
+          </w:tcPr>
+          <w:p>
+            <w:pPr>
+              <w:spacing w:after="40"/>
+            </w:pPr>
+            <w:r>
+              <w:rPr>
+                <w:b/>
+                <w:bCs/>
+                <w:sz w:val="20"/>
+                <w:szCs w:val="20"/>
+              </w:rPr>
+              <w:t>Pendientes</w:t>
+            </w:r>
+          </w:p>
+        </w:tc>
+        <w:tc>
+          <w:tcPr>
+            <w:tcW w:type="dxa" w:w="6860"/>
+            <w:tcBorders>
+              <w:top w:val="single" w:color="8EAADB" w:sz="4"/>
+              <w:left w:val="single" w:color="8EAADB" w:sz="4"/>
+              <w:bottom w:val="single" w:color="8EAADB" w:sz="4"/>
+              <w:right w:val="single" w:color="8EAADB" w:sz="4"/>
+            </w:tcBorders>
+            <w:tcMar>
+              <w:top w:type="dxa" w:w="60"/>
+              <w:left w:type="dxa" w:w="100"/>
+              <w:bottom w:type="dxa" w:w="60"/>
+              <w:right w:type="dxa" w:w="100"/>
+            </w:tcMar>
+          </w:tcPr>
+          <w:p>
+            <w:pPr>
+              <w:pStyle w:val="ListParagraph"/>
+              <w:numPr>
+                <w:ilvl w:val="0"/>
+                <w:numId w:val="2"/>
+              </w:numPr>
+              <w:spacing w:after="40"/>
+            </w:pPr>
+            <w:r>
+              <w:rPr>
+                <w:sz w:val="20"/>
+                <w:szCs w:val="20"/>
+              </w:rPr>
+              <w:t>Sesión P05 (21/10) y estadística SUS con intervalo de confianza del 95 %.</w:t>
+            </w:r>
+          </w:p>
+          <w:p>
+            <w:pPr>
+              <w:pStyle w:val="ListParagraph"/>
+              <w:numPr>
+                <w:ilvl w:val="0"/>
+                <w:numId w:val="2"/>
+              </w:numPr>
+              <w:spacing w:after="40"/>
+            </w:pPr>
+            <w:r>
+              <w:rPr>
+                <w:sz w:val="20"/>
+                <w:szCs w:val="20"/>
+              </w:rPr>
+              <w:t>HU-21, HU-23 y HU-20 (registro del cuidador contratado), y RLS por cuidador (HU-19).</w:t>
+            </w:r>
+          </w:p>
+        </w:tc>
+      </w:tr>
+    </w:tbl>
+    <w:p>
+      <w:pPr>
+        <w:pStyle w:val="Heading2"/>
+      </w:pPr>
+      <w:r>
+        <w:t>Bitácora semanal del Sprint 4</w:t>
+      </w:r>
+    </w:p>
+    <w:p>
+      <w:pPr>
+        <w:spacing w:after="80" w:before="120"/>
+      </w:pPr>
+      <w:r>
+        <w:rPr>
+          <w:i/>
+          <w:iCs/>
+          <w:sz w:val="20"/>
+          <w:szCs w:val="20"/>
+        </w:rPr>
+        <w:t>Tabla H. Registro semanal del Sprint 4</w:t>
+      </w:r>
+    </w:p>
+    <w:tbl>
+      <w:tblPr>
+        <w:tblW w:type="dxa" w:w="9360"/>
+        <w:tblBorders>
+          <w:top w:val="single" w:color="auto" w:sz="4"/>
+          <w:left w:val="single" w:color="auto" w:sz="4"/>
+          <w:bottom w:val="single" w:color="auto" w:sz="4"/>
+          <w:right w:val="single" w:color="auto" w:sz="4"/>
+          <w:insideH w:val="single" w:color="auto" w:sz="4"/>
+          <w:insideV w:val="single" w:color="auto" w:sz="4"/>
+        </w:tblBorders>
+      </w:tblPr>
+      <w:tblGrid>
+        <w:gridCol w:w="1600"/>
+        <w:gridCol w:w="1500"/>
+        <w:gridCol w:w="2700"/>
+        <w:gridCol w:w="3560"/>
+      </w:tblGrid>
+      <w:tr>
+        <w:trPr>
+          <w:tblHeader/>
+        </w:trPr>
+        <w:tc>
+          <w:tcPr>
+            <w:tcW w:type="dxa" w:w="1600"/>
+            <w:tcBorders>
+              <w:top w:val="single" w:color="8EAADB" w:sz="4"/>
+              <w:left w:val="single" w:color="8EAADB" w:sz="4"/>
+              <w:bottom w:val="single" w:color="8EAADB" w:sz="4"/>
+              <w:right w:val="single" w:color="8EAADB" w:sz="4"/>
+            </w:tcBorders>
+            <w:shd w:fill="2F5496" w:color="auto" w:val="clear"/>
+            <w:tcMar>
+              <w:top w:type="dxa" w:w="60"/>
+              <w:left w:type="dxa" w:w="100"/>
+              <w:bottom w:type="dxa" w:w="60"/>
+              <w:right w:type="dxa" w:w="100"/>
+            </w:tcMar>
+          </w:tcPr>
+          <w:p>
+            <w:r>
+              <w:rPr>
+                <w:b/>
+                <w:bCs/>
+                <w:color w:val="FFFFFF"/>
+                <w:sz w:val="20"/>
+                <w:szCs w:val="20"/>
+              </w:rPr>
+              <w:t>Semana</w:t>
+            </w:r>
+          </w:p>
+        </w:tc>
+        <w:tc>
+          <w:tcPr>
+            <w:tcW w:type="dxa" w:w="1500"/>
+            <w:tcBorders>
+              <w:top w:val="single" w:color="8EAADB" w:sz="4"/>
+              <w:left w:val="single" w:color="8EAADB" w:sz="4"/>
+              <w:bottom w:val="single" w:color="8EAADB" w:sz="4"/>
+              <w:right w:val="single" w:color="8EAADB" w:sz="4"/>
+            </w:tcBorders>
+            <w:shd w:fill="2F5496" w:color="auto" w:val="clear"/>
+            <w:tcMar>
+              <w:top w:type="dxa" w:w="60"/>
+              <w:left w:type="dxa" w:w="100"/>
+              <w:bottom w:type="dxa" w:w="60"/>
+              <w:right w:type="dxa" w:w="100"/>
+            </w:tcMar>
+          </w:tcPr>
+          <w:p>
+            <w:r>
+              <w:rPr>
+                <w:b/>
+                <w:bCs/>
+                <w:color w:val="FFFFFF"/>
+                <w:sz w:val="20"/>
+                <w:szCs w:val="20"/>
+              </w:rPr>
+              <w:t>Fechas</w:t>
+            </w:r>
+          </w:p>
+        </w:tc>
+        <w:tc>
+          <w:tcPr>
+            <w:tcW w:type="dxa" w:w="2700"/>
+            <w:tcBorders>
+              <w:top w:val="single" w:color="8EAADB" w:sz="4"/>
+              <w:left w:val="single" w:color="8EAADB" w:sz="4"/>
+              <w:bottom w:val="single" w:color="8EAADB" w:sz="4"/>
+              <w:right w:val="single" w:color="8EAADB" w:sz="4"/>
+            </w:tcBorders>
+            <w:shd w:fill="2F5496" w:color="auto" w:val="clear"/>
+            <w:tcMar>
+              <w:top w:type="dxa" w:w="60"/>
+              <w:left w:type="dxa" w:w="100"/>
+              <w:bottom w:type="dxa" w:w="60"/>
+              <w:right w:type="dxa" w:w="100"/>
+            </w:tcMar>
+          </w:tcPr>
+          <w:p>
+            <w:r>
+              <w:rPr>
+                <w:b/>
+                <w:bCs/>
+                <w:color w:val="FFFFFF"/>
+                <w:sz w:val="20"/>
+                <w:szCs w:val="20"/>
+              </w:rPr>
+              <w:t>Trabajo realizado y evidencias</w:t>
+            </w:r>
+          </w:p>
+        </w:tc>
+        <w:tc>
+          <w:tcPr>
+            <w:tcW w:type="dxa" w:w="3560"/>
+            <w:tcBorders>
+              <w:top w:val="single" w:color="8EAADB" w:sz="4"/>
+              <w:left w:val="single" w:color="8EAADB" w:sz="4"/>
+              <w:bottom w:val="single" w:color="8EAADB" w:sz="4"/>
+              <w:right w:val="single" w:color="8EAADB" w:sz="4"/>
+            </w:tcBorders>
+            <w:shd w:fill="2F5496" w:color="auto" w:val="clear"/>
+            <w:tcMar>
+              <w:top w:type="dxa" w:w="60"/>
+              <w:left w:type="dxa" w:w="100"/>
+              <w:bottom w:type="dxa" w:w="60"/>
+              <w:right w:type="dxa" w:w="100"/>
+            </w:tcMar>
+          </w:tcPr>
+          <w:p>
+            <w:r>
+              <w:rPr>
+                <w:b/>
+                <w:bCs/>
+                <w:color w:val="FFFFFF"/>
+                <w:sz w:val="20"/>
+                <w:szCs w:val="20"/>
+              </w:rPr>
+              <w:t>Próxima semana</w:t>
+            </w:r>
+          </w:p>
+        </w:tc>
+      </w:tr>
+      <w:tr>
+        <w:tc>
+          <w:tcPr>
+            <w:tcW w:type="dxa" w:w="1600"/>
+            <w:tcBorders>
+              <w:top w:val="single" w:color="8EAADB" w:sz="4"/>
+              <w:left w:val="single" w:color="8EAADB" w:sz="4"/>
+              <w:bottom w:val="single" w:color="8EAADB" w:sz="4"/>
+              <w:right w:val="single" w:color="8EAADB" w:sz="4"/>
+            </w:tcBorders>
+            <w:tcMar>
+              <w:top w:type="dxa" w:w="60"/>
+              <w:left w:type="dxa" w:w="100"/>
+              <w:bottom w:type="dxa" w:w="60"/>
+              <w:right w:type="dxa" w:w="100"/>
+            </w:tcMar>
+          </w:tcPr>
+          <w:p>
+            <w:pPr>
+              <w:spacing w:after="40"/>
+            </w:pPr>
+            <w:r>
+              <w:rPr>
+                <w:sz w:val="20"/>
+                <w:szCs w:val="20"/>
+              </w:rPr>
+              <w:t>S10</w:t>
+            </w:r>
+          </w:p>
+        </w:tc>
+        <w:tc>
+          <w:tcPr>
+            <w:tcW w:type="dxa" w:w="1500"/>
+            <w:tcBorders>
+              <w:top w:val="single" w:color="8EAADB" w:sz="4"/>
+              <w:left w:val="single" w:color="8EAADB" w:sz="4"/>
+              <w:bottom w:val="single" w:color="8EAADB" w:sz="4"/>
+              <w:right w:val="single" w:color="8EAADB" w:sz="4"/>
+            </w:tcBorders>
+            <w:tcMar>
+              <w:top w:type="dxa" w:w="60"/>
+              <w:left w:type="dxa" w:w="100"/>
+              <w:bottom w:type="dxa" w:w="60"/>
+              <w:right w:type="dxa" w:w="100"/>
+            </w:tcMar>
+          </w:tcPr>
+          <w:p>
+            <w:pPr>
+              <w:spacing w:after="40"/>
+            </w:pPr>
+            <w:r>
+              <w:rPr>
+                <w:sz w:val="20"/>
+                <w:szCs w:val="20"/>
+              </w:rPr>
+              <w:t>12 – 18 oct</w:t>
+            </w:r>
+          </w:p>
+        </w:tc>
+        <w:tc>
+          <w:tcPr>
+            <w:tcW w:type="dxa" w:w="2700"/>
+            <w:tcBorders>
+              <w:top w:val="single" w:color="8EAADB" w:sz="4"/>
+              <w:left w:val="single" w:color="8EAADB" w:sz="4"/>
+              <w:bottom w:val="single" w:color="8EAADB" w:sz="4"/>
+              <w:right w:val="single" w:color="8EAADB" w:sz="4"/>
+            </w:tcBorders>
+            <w:tcMar>
+              <w:top w:type="dxa" w:w="60"/>
+              <w:left w:type="dxa" w:w="100"/>
+              <w:bottom w:type="dxa" w:w="60"/>
+              <w:right w:type="dxa" w:w="100"/>
+            </w:tcMar>
+          </w:tcPr>
+          <w:p>
+            <w:pPr>
+              <w:spacing w:after="40"/>
+            </w:pPr>
+            <w:r>
+              <w:rPr>
+                <w:sz w:val="20"/>
+                <w:szCs w:val="20"/>
+              </w:rPr>
+              <w:t>Reintento automático de Ampere y protocolo SUS por videollamada (6c56335). Diarios y autoevaluaciones al día (dbfdb4e). Sesiones SUS P01 (15/10), P02 (17/10) y P03 (18/10). Corrección de la hora del panel por el hallazgo H-P02-5 (5f95c1c).</w:t>
+            </w:r>
+          </w:p>
+        </w:tc>
+        <w:tc>
+          <w:tcPr>
+            <w:tcW w:type="dxa" w:w="3560"/>
+            <w:tcBorders>
+              <w:top w:val="single" w:color="8EAADB" w:sz="4"/>
+              <w:left w:val="single" w:color="8EAADB" w:sz="4"/>
+              <w:bottom w:val="single" w:color="8EAADB" w:sz="4"/>
+              <w:right w:val="single" w:color="8EAADB" w:sz="4"/>
+            </w:tcBorders>
+            <w:tcMar>
+              <w:top w:type="dxa" w:w="60"/>
+              <w:left w:type="dxa" w:w="100"/>
+              <w:bottom w:type="dxa" w:w="60"/>
+              <w:right w:type="dxa" w:w="100"/>
+            </w:tcMar>
+          </w:tcPr>
+          <w:p>
+            <w:pPr>
+              <w:spacing w:after="40"/>
+            </w:pPr>
+            <w:r>
+              <w:rPr>
+                <w:sz w:val="20"/>
+                <w:szCs w:val="20"/>
+              </w:rPr>
+              <w:t>Sesiones P04 y P05; prueba de carga.</w:t>
+            </w:r>
+          </w:p>
+        </w:tc>
+      </w:tr>
+      <w:tr>
+        <w:tc>
+          <w:tcPr>
+            <w:tcW w:type="dxa" w:w="1600"/>
+            <w:tcBorders>
+              <w:top w:val="single" w:color="8EAADB" w:sz="4"/>
+              <w:left w:val="single" w:color="8EAADB" w:sz="4"/>
+              <w:bottom w:val="single" w:color="8EAADB" w:sz="4"/>
+              <w:right w:val="single" w:color="8EAADB" w:sz="4"/>
+            </w:tcBorders>
+            <w:tcMar>
+              <w:top w:type="dxa" w:w="60"/>
+              <w:left w:type="dxa" w:w="100"/>
+              <w:bottom w:type="dxa" w:w="60"/>
+              <w:right w:type="dxa" w:w="100"/>
+            </w:tcMar>
+          </w:tcPr>
+          <w:p>
+            <w:pPr>
+              <w:spacing w:after="40"/>
+            </w:pPr>
+            <w:r>
+              <w:rPr>
+                <w:sz w:val="20"/>
+                <w:szCs w:val="20"/>
+              </w:rPr>
+              <w:t>S11</w:t>
+            </w:r>
+          </w:p>
+        </w:tc>
+        <w:tc>
+          <w:tcPr>
+            <w:tcW w:type="dxa" w:w="1500"/>
+            <w:tcBorders>
+              <w:top w:val="single" w:color="8EAADB" w:sz="4"/>
+              <w:left w:val="single" w:color="8EAADB" w:sz="4"/>
+              <w:bottom w:val="single" w:color="8EAADB" w:sz="4"/>
+              <w:right w:val="single" w:color="8EAADB" w:sz="4"/>
+            </w:tcBorders>
+            <w:tcMar>
+              <w:top w:type="dxa" w:w="60"/>
+              <w:left w:type="dxa" w:w="100"/>
+              <w:bottom w:type="dxa" w:w="60"/>
+              <w:right w:type="dxa" w:w="100"/>
+            </w:tcMar>
+          </w:tcPr>
+          <w:p>
+            <w:pPr>
+              <w:spacing w:after="40"/>
+            </w:pPr>
+            <w:r>
+              <w:rPr>
+                <w:sz w:val="20"/>
+                <w:szCs w:val="20"/>
+              </w:rPr>
+              <w:t>19 – 25 oct (corte 20/10)</w:t>
+            </w:r>
+          </w:p>
+        </w:tc>
+        <w:tc>
+          <w:tcPr>
+            <w:tcW w:type="dxa" w:w="2700"/>
+            <w:tcBorders>
+              <w:top w:val="single" w:color="8EAADB" w:sz="4"/>
+              <w:left w:val="single" w:color="8EAADB" w:sz="4"/>
+              <w:bottom w:val="single" w:color="8EAADB" w:sz="4"/>
+              <w:right w:val="single" w:color="8EAADB" w:sz="4"/>
+            </w:tcBorders>
+            <w:tcMar>
+              <w:top w:type="dxa" w:w="60"/>
+              <w:left w:type="dxa" w:w="100"/>
+              <w:bottom w:type="dxa" w:w="60"/>
+              <w:right w:type="dxa" w:w="100"/>
+            </w:tcMar>
+          </w:tcPr>
+          <w:p>
+            <w:pPr>
+              <w:spacing w:after="40"/>
+            </w:pPr>
+            <w:r>
+              <w:rPr>
+                <w:sz w:val="20"/>
+                <w:szCs w:val="20"/>
+              </w:rPr>
+              <w:t>Segunda aplicación SUS de P03 y sesión P04 (19/10); notas P01 a P04 en el repositorio (42ba705). Retroalimentación de la Evaluación 2 (20/10): limpieza de backend/app (1a82453), prueba de carga PR-04 (455a5b0), backlog con HU-20 a HU-23 y esta ficha.</w:t>
+            </w:r>
+          </w:p>
+        </w:tc>
+        <w:tc>
+          <w:tcPr>
+            <w:tcW w:type="dxa" w:w="3560"/>
+            <w:tcBorders>
+              <w:top w:val="single" w:color="8EAADB" w:sz="4"/>
+              <w:left w:val="single" w:color="8EAADB" w:sz="4"/>
+              <w:bottom w:val="single" w:color="8EAADB" w:sz="4"/>
+              <w:right w:val="single" w:color="8EAADB" w:sz="4"/>
+            </w:tcBorders>
+            <w:tcMar>
+              <w:top w:type="dxa" w:w="60"/>
+              <w:left w:type="dxa" w:w="100"/>
+              <w:bottom w:type="dxa" w:w="60"/>
+              <w:right w:type="dxa" w:w="100"/>
+            </w:tcMar>
+          </w:tcPr>
+          <w:p>
+            <w:pPr>
+              <w:spacing w:after="40"/>
+            </w:pPr>
+            <w:r>
+              <w:rPr>
+                <w:sz w:val="20"/>
+                <w:szCs w:val="20"/>
+              </w:rPr>
+              <w:t>Sesión P05 (21/10), estadística SUS con IC 95 % y reenvío del documento 2.4.</w:t>
+            </w:r>
+          </w:p>
+        </w:tc>
+      </w:tr>
+      <w:tr>
+        <w:tc>
+          <w:tcPr>
+            <w:tcW w:type="dxa" w:w="1600"/>
+            <w:tcBorders>
+              <w:top w:val="single" w:color="8EAADB" w:sz="4"/>
+              <w:left w:val="single" w:color="8EAADB" w:sz="4"/>
+              <w:bottom w:val="single" w:color="8EAADB" w:sz="4"/>
+              <w:right w:val="single" w:color="8EAADB" w:sz="4"/>
+            </w:tcBorders>
+            <w:tcMar>
+              <w:top w:type="dxa" w:w="60"/>
+              <w:left w:type="dxa" w:w="100"/>
+              <w:bottom w:type="dxa" w:w="60"/>
+              <w:right w:type="dxa" w:w="100"/>
+            </w:tcMar>
+          </w:tcPr>
+          <w:p>
+            <w:pPr>
+              <w:spacing w:after="40"/>
+            </w:pPr>
+            <w:r>
+              <w:rPr>
+                <w:sz w:val="20"/>
+                <w:szCs w:val="20"/>
+              </w:rPr>
+              <w:t>S12</w:t>
+            </w:r>
+          </w:p>
+        </w:tc>
+        <w:tc>
+          <w:tcPr>
+            <w:tcW w:type="dxa" w:w="1500"/>
+            <w:tcBorders>
+              <w:top w:val="single" w:color="8EAADB" w:sz="4"/>
+              <w:left w:val="single" w:color="8EAADB" w:sz="4"/>
+              <w:bottom w:val="single" w:color="8EAADB" w:sz="4"/>
+              <w:right w:val="single" w:color="8EAADB" w:sz="4"/>
+            </w:tcBorders>
+            <w:tcMar>
+              <w:top w:type="dxa" w:w="60"/>
+              <w:left w:type="dxa" w:w="100"/>
+              <w:bottom w:type="dxa" w:w="60"/>
+              <w:right w:type="dxa" w:w="100"/>
+            </w:tcMar>
+          </w:tcPr>
+          <w:p>
+            <w:pPr>
+              <w:spacing w:after="40"/>
+            </w:pPr>
+            <w:r>
+              <w:rPr>
+                <w:sz w:val="20"/>
+                <w:szCs w:val="20"/>
+              </w:rPr>
+              <w:t>26 oct – 1 nov</w:t>
+            </w:r>
+          </w:p>
+        </w:tc>
+        <w:tc>
+          <w:tcPr>
+            <w:tcW w:type="dxa" w:w="2700"/>
+            <w:tcBorders>
+              <w:top w:val="single" w:color="8EAADB" w:sz="4"/>
+              <w:left w:val="single" w:color="8EAADB" w:sz="4"/>
+              <w:bottom w:val="single" w:color="8EAADB" w:sz="4"/>
+              <w:right w:val="single" w:color="8EAADB" w:sz="4"/>
+            </w:tcBorders>
+            <w:tcMar>
+              <w:top w:type="dxa" w:w="60"/>
+              <w:left w:type="dxa" w:w="100"/>
+              <w:bottom w:type="dxa" w:w="60"/>
+              <w:right w:type="dxa" w:w="100"/>
+            </w:tcMar>
+          </w:tcPr>
+          <w:p>
+            <w:pPr>
+              <w:spacing w:after="40"/>
+            </w:pPr>
+            <w:r>
+              <w:rPr>
+                <w:sz w:val="20"/>
+                <w:szCs w:val="20"/>
+              </w:rPr>
+              <w:t>Planificada: HU-21 (semáforo y estado de los sensores) y HU-23 (contraste). Disponibilidad reducida por turno laboral del 22 al 28/10.</w:t>
+            </w:r>
+          </w:p>
+        </w:tc>
+        <w:tc>
+          <w:tcPr>
+            <w:tcW w:type="dxa" w:w="3560"/>
+            <w:tcBorders>
+              <w:top w:val="single" w:color="8EAADB" w:sz="4"/>
+              <w:left w:val="single" w:color="8EAADB" w:sz="4"/>
+              <w:bottom w:val="single" w:color="8EAADB" w:sz="4"/>
+              <w:right w:val="single" w:color="8EAADB" w:sz="4"/>
+            </w:tcBorders>
+            <w:tcMar>
+              <w:top w:type="dxa" w:w="60"/>
+              <w:left w:type="dxa" w:w="100"/>
+              <w:bottom w:type="dxa" w:w="60"/>
+              <w:right w:type="dxa" w:w="100"/>
+            </w:tcMar>
+          </w:tcPr>
+          <w:p>
+            <w:pPr>
+              <w:spacing w:after="40"/>
+            </w:pPr>
+            <w:r>
+              <w:rPr>
+                <w:sz w:val="20"/>
+                <w:szCs w:val="20"/>
+              </w:rPr>
+              <w:t>Cierre del Sprint 4 y retrospectiva.</w:t>
             </w:r>
           </w:p>
         </w:tc>

</xml_diff>

<commit_message>
docs(agil): ajuste de redaccion en la ficha y bitacora del Sprint 4
Co-Authored-By: Claude Opus 5.5 <noreply@anthropic.com>

Claude-Session: https://claude.ai/code/session_01HM9mpD45KG7KmxBSVWVKiY
</commit_message>
<xml_diff>
--- a/docs/fase2/evidencias_proyecto/documentacion/agil/Fichas_Sprint_1-3_DomoVida.docx
+++ b/docs/fase2/evidencias_proyecto/documentacion/agil/Fichas_Sprint_1-3_DomoVida.docx
@@ -9099,23 +9099,6 @@
                 <w:sz w:val="20"/>
                 <w:szCs w:val="20"/>
               </w:rPr>
-              <w:t>P03 respondió el SUS con 5 en todos los ítems, también en los negativos.</w:t>
-            </w:r>
-          </w:p>
-          <w:p>
-            <w:pPr>
-              <w:pStyle w:val="ListParagraph"/>
-              <w:numPr>
-                <w:ilvl w:val="0"/>
-                <w:numId w:val="2"/>
-              </w:numPr>
-              <w:spacing w:after="40"/>
-            </w:pPr>
-            <w:r>
-              <w:rPr>
-                <w:sz w:val="20"/>
-                <w:szCs w:val="20"/>
-              </w:rPr>
               <w:t>El teléfono de P02 mostraba una hora distinta a la del panel.</w:t>
             </w:r>
           </w:p>
@@ -9218,7 +9201,7 @@
                 <w:sz w:val="20"/>
                 <w:szCs w:val="20"/>
               </w:rPr>
-              <w:t>Advertencia sobre ítems positivos y negativos antes de la encuesta; segunda aplicación a P03 documentada con análisis de sensibilidad.</w:t>
+              <w:t>Advertencia, antes de la encuesta, de que el cuestionario alterna frases positivas y negativas.</w:t>
             </w:r>
           </w:p>
           <w:p>
@@ -9693,7 +9676,7 @@
                 <w:sz w:val="20"/>
                 <w:szCs w:val="20"/>
               </w:rPr>
-              <w:t>Segunda aplicación SUS de P03 y sesión P04 (19/10); notas P01 a P04 en el repositorio (42ba705). Retroalimentación de la Evaluación 2 (20/10): limpieza de backend/app (1a82453), prueba de carga PR-04 (455a5b0), backlog con HU-20 a HU-23 y esta ficha.</w:t>
+              <w:t>Sesión P04 (19/10); notas P01 a P04 en el repositorio (42ba705). Retroalimentación de la Evaluación 2 (20/10): limpieza de backend/app (1a82453), prueba de carga PR-04 (455a5b0), backlog con HU-20 a HU-23 y esta ficha.</w:t>
             </w:r>
           </w:p>
         </w:tc>

</xml_diff>